<commit_message>
continued context development; additions to WC helpercells
</commit_message>
<xml_diff>
--- a/EconAutomation/src/supporting_docs/econ_report_templates/PV_Earnings_Report_Template.docx
+++ b/EconAutomation/src/supporting_docs/econ_report_templates/PV_Earnings_Report_Template.docx
@@ -35,24 +35,10 @@
       <w:r>
         <w:rPr>
           <w:bCs/>
-          <w:sz w:val="24"/>
-        </w:rPr>
-        <w:instrText xml:space="preserve"> DATE \@ "MMMM d, yyyy" </w:instrText>
-      </w:r>
-      <w:r>
-        <w:rPr>
-          <w:bCs/>
-          <w:sz w:val="24"/>
-        </w:rPr>
-        <w:fldChar w:fldCharType="separate"/>
-      </w:r>
-      <w:r>
-        <w:rPr>
-          <w:bCs/>
           <w:noProof/>
           <w:sz w:val="24"/>
         </w:rPr>
-        <w:t>May 25, 2026</w:t>
+        <w:instrText>May 25, 2026</w:instrText>
       </w:r>
       <w:r>
         <w:rPr>
@@ -60,6 +46,91 @@
           <w:sz w:val="24"/>
         </w:rPr>
         <w:fldChar w:fldCharType="end"/>
+      </w:r>
+      <w:r>
+        <w:rPr>
+          <w:color w:val="000000"/>
+          <w:sz w:val="23"/>
+          <w:szCs w:val="23"/>
+        </w:rPr>
+        <w:t>{{ attorney_salutation_with_name_full }}</w:t>
+      </w:r>
+    </w:p>
+    <w:p>
+      <w:pPr>
+        <w:widowControl w:val="0"/>
+        <w:autoSpaceDE w:val="0"/>
+        <w:autoSpaceDN w:val="0"/>
+        <w:adjustRightInd w:val="0"/>
+        <w:rPr>
+          <w:iCs/>
+          <w:sz w:val="24"/>
+          <w:szCs w:val="24"/>
+        </w:rPr>
+      </w:pPr>
+      <w:r>
+        <w:rPr>
+          <w:color w:val="000000"/>
+          <w:sz w:val="23"/>
+          <w:szCs w:val="23"/>
+        </w:rPr>
+        <w:t>{{ firm_address_full }}</w:t>
+      </w:r>
+    </w:p>
+    <w:p>
+      <w:pPr>
+        <w:rPr>
+          <w:b/>
+          <w:bCs/>
+          <w:i/>
+          <w:iCs/>
+          <w:sz w:val="24"/>
+          <w:szCs w:val="24"/>
+        </w:rPr>
+      </w:pPr>
+    </w:p>
+    <w:p>
+      <w:pPr>
+        <w:rPr>
+          <w:b/>
+          <w:bCs/>
+          <w:i/>
+          <w:iCs/>
+          <w:sz w:val="24"/>
+          <w:szCs w:val="24"/>
+        </w:rPr>
+      </w:pPr>
+    </w:p>
+    <w:p>
+      <w:pPr>
+        <w:rPr>
+          <w:b/>
+          <w:bCs/>
+          <w:i/>
+          <w:iCs/>
+          <w:sz w:val="24"/>
+          <w:szCs w:val="24"/>
+        </w:rPr>
+      </w:pPr>
+      <w:r>
+        <w:rPr>
+          <w:b/>
+          <w:bCs/>
+          <w:i/>
+          <w:iCs/>
+          <w:sz w:val="24"/>
+          <w:szCs w:val="24"/>
+        </w:rPr>
+        <w:t xml:space="preserve">VIA EMAIL: </w:t>
+      </w:r>
+      <w:r>
+        <w:rPr>
+          <w:b/>
+          <w:bCs/>
+          <w:i/>
+          <w:iCs/>
+        </w:rPr>
+        <w:t>{{r firm_email }}</w:t>
       </w:r>
     </w:p>
     <w:p>
@@ -83,106 +154,78 @@
         <w:rPr>
           <w:bCs/>
           <w:sz w:val="24"/>
-          <w:highlight w:val="yellow"/>
-        </w:rPr>
-      </w:pPr>
-    </w:p>
-    <w:p>
-      <w:pPr>
-        <w:widowControl w:val="0"/>
-        <w:autoSpaceDE w:val="0"/>
-        <w:autoSpaceDN w:val="0"/>
-        <w:adjustRightInd w:val="0"/>
+        </w:rPr>
+      </w:pPr>
+    </w:p>
+    <w:p>
+      <w:pPr>
+        <w:tabs>
+          <w:tab w:val="left" w:pos="0"/>
+          <w:tab w:val="left" w:pos="720"/>
+          <w:tab w:val="left" w:pos="1440"/>
+          <w:tab w:val="left" w:pos="2160"/>
+          <w:tab w:val="left" w:pos="2880"/>
+          <w:tab w:val="left" w:pos="3600"/>
+          <w:tab w:val="left" w:pos="4320"/>
+          <w:tab w:val="left" w:pos="5040"/>
+          <w:tab w:val="left" w:pos="5760"/>
+          <w:tab w:val="left" w:pos="6480"/>
+          <w:tab w:val="left" w:pos="7200"/>
+          <w:tab w:val="left" w:pos="7920"/>
+        </w:tabs>
+        <w:suppressAutoHyphens/>
+        <w:jc w:val="right"/>
+        <w:rPr>
+          <w:bCs/>
+          <w:sz w:val="24"/>
+        </w:rPr>
+      </w:pPr>
+      <w:r>
+        <w:rPr>
+          <w:bCs/>
+          <w:sz w:val="24"/>
+        </w:rPr>
+        <w:t xml:space="preserve">RE: </w:t>
+      </w:r>
+      <w:r>
         <w:rPr>
           <w:color w:val="000000"/>
           <w:sz w:val="23"/>
           <w:szCs w:val="23"/>
         </w:rPr>
-      </w:pPr>
+        <w:t>{{ claimant_name_full }}</w:t>
+      </w:r>
       <w:r>
         <w:rPr>
           <w:color w:val="000000"/>
           <w:sz w:val="23"/>
           <w:szCs w:val="23"/>
         </w:rPr>
-        <w:t>{{ attorney_salutation_with_name_full }}</w:t>
-      </w:r>
-    </w:p>
-    <w:p>
-      <w:pPr>
-        <w:widowControl w:val="0"/>
-        <w:autoSpaceDE w:val="0"/>
-        <w:autoSpaceDN w:val="0"/>
-        <w:adjustRightInd w:val="0"/>
-        <w:rPr>
-          <w:iCs/>
-          <w:sz w:val="24"/>
-          <w:szCs w:val="24"/>
-        </w:rPr>
-      </w:pPr>
+        <w:tab/>
+      </w:r>
       <w:r>
         <w:rPr>
           <w:color w:val="000000"/>
           <w:sz w:val="23"/>
           <w:szCs w:val="23"/>
         </w:rPr>
-        <w:t>{{ firm_address_full }}</w:t>
-      </w:r>
-    </w:p>
-    <w:p>
-      <w:pPr>
-        <w:rPr>
-          <w:b/>
-          <w:bCs/>
-          <w:i/>
-          <w:iCs/>
-          <w:sz w:val="24"/>
-          <w:szCs w:val="24"/>
-        </w:rPr>
-      </w:pPr>
-    </w:p>
-    <w:p>
-      <w:pPr>
-        <w:rPr>
-          <w:b/>
-          <w:bCs/>
-          <w:i/>
-          <w:iCs/>
-          <w:sz w:val="24"/>
-          <w:szCs w:val="24"/>
-        </w:rPr>
-      </w:pPr>
-    </w:p>
-    <w:p>
-      <w:pPr>
-        <w:rPr>
-          <w:b/>
-          <w:bCs/>
-          <w:i/>
-          <w:iCs/>
-          <w:sz w:val="24"/>
-          <w:szCs w:val="24"/>
-        </w:rPr>
-      </w:pPr>
-      <w:r>
-        <w:rPr>
-          <w:b/>
-          <w:bCs/>
-          <w:i/>
-          <w:iCs/>
-          <w:sz w:val="24"/>
-          <w:szCs w:val="24"/>
-        </w:rPr>
-        <w:t xml:space="preserve">VIA EMAIL: </w:t>
-      </w:r>
-      <w:r>
-        <w:rPr>
-          <w:b/>
-          <w:bCs/>
-          <w:i/>
-          <w:iCs/>
-        </w:rPr>
-        <w:t>{{r firm_email }}</w:t>
+        <w:tab/>
+      </w:r>
+      <w:r>
+        <w:rPr>
+          <w:color w:val="000000"/>
+          <w:sz w:val="23"/>
+          <w:szCs w:val="23"/>
+        </w:rPr>
+        <w:tab/>
+      </w:r>
+      <w:r>
+        <w:rPr>
+          <w:color w:val="000000"/>
+          <w:sz w:val="23"/>
+          <w:szCs w:val="23"/>
+        </w:rPr>
+        <w:tab/>
       </w:r>
     </w:p>
     <w:p>
@@ -208,6 +251,13 @@
           <w:sz w:val="24"/>
         </w:rPr>
       </w:pPr>
+      <w:r>
+        <w:rPr>
+          <w:bCs/>
+          <w:sz w:val="24"/>
+        </w:rPr>
+        <w:tab/>
+      </w:r>
     </w:p>
     <w:p>
       <w:pPr>
@@ -232,57 +282,6 @@
           <w:sz w:val="24"/>
         </w:rPr>
       </w:pPr>
-      <w:r>
-        <w:rPr>
-          <w:bCs/>
-          <w:sz w:val="24"/>
-        </w:rPr>
-        <w:tab/>
-      </w:r>
-      <w:r>
-        <w:rPr>
-          <w:bCs/>
-          <w:sz w:val="24"/>
-        </w:rPr>
-        <w:tab/>
-      </w:r>
-      <w:r>
-        <w:rPr>
-          <w:bCs/>
-          <w:sz w:val="24"/>
-        </w:rPr>
-        <w:tab/>
-      </w:r>
-      <w:r>
-        <w:rPr>
-          <w:bCs/>
-          <w:sz w:val="24"/>
-        </w:rPr>
-        <w:tab/>
-      </w:r>
-      <w:r>
-        <w:rPr>
-          <w:bCs/>
-          <w:sz w:val="24"/>
-        </w:rPr>
-        <w:tab/>
-      </w:r>
-      <w:r>
-        <w:rPr>
-          <w:bCs/>
-          <w:sz w:val="24"/>
-        </w:rPr>
-        <w:tab/>
-        <w:t xml:space="preserve">RE: </w:t>
-      </w:r>
-      <w:r>
-        <w:rPr>
-          <w:color w:val="000000"/>
-          <w:sz w:val="23"/>
-          <w:szCs w:val="23"/>
-        </w:rPr>
-        <w:t>{{ claimant_name_full }}</w:t>
-      </w:r>
     </w:p>
     <w:p>
       <w:pPr>
@@ -312,26 +311,25 @@
           <w:bCs/>
           <w:sz w:val="24"/>
         </w:rPr>
-        <w:tab/>
-      </w:r>
-    </w:p>
-    <w:p>
-      <w:pPr>
-        <w:tabs>
-          <w:tab w:val="left" w:pos="0"/>
-          <w:tab w:val="left" w:pos="720"/>
-          <w:tab w:val="left" w:pos="1440"/>
-          <w:tab w:val="left" w:pos="2160"/>
-          <w:tab w:val="left" w:pos="2880"/>
-          <w:tab w:val="left" w:pos="3600"/>
-          <w:tab w:val="left" w:pos="4320"/>
-          <w:tab w:val="left" w:pos="5040"/>
-          <w:tab w:val="left" w:pos="5760"/>
-          <w:tab w:val="left" w:pos="6480"/>
-          <w:tab w:val="left" w:pos="7200"/>
-          <w:tab w:val="left" w:pos="7920"/>
-        </w:tabs>
-        <w:suppressAutoHyphens/>
+        <w:t xml:space="preserve">Dear </w:t>
+      </w:r>
+      <w:r>
+        <w:rPr>
+          <w:sz w:val="24"/>
+          <w:szCs w:val="24"/>
+        </w:rPr>
+        <w:t>{{ attorney_salutation_with_name_last }}</w:t>
+      </w:r>
+      <w:r>
+        <w:rPr>
+          <w:bCs/>
+          <w:sz w:val="24"/>
+        </w:rPr>
+        <w:t xml:space="preserve">: </w:t>
+      </w:r>
+    </w:p>
+    <w:p>
+      <w:pPr>
         <w:jc w:val="both"/>
         <w:rPr>
           <w:bCs/>
@@ -341,21 +339,6 @@
     </w:p>
     <w:p>
       <w:pPr>
-        <w:tabs>
-          <w:tab w:val="left" w:pos="0"/>
-          <w:tab w:val="left" w:pos="720"/>
-          <w:tab w:val="left" w:pos="1440"/>
-          <w:tab w:val="left" w:pos="2160"/>
-          <w:tab w:val="left" w:pos="2880"/>
-          <w:tab w:val="left" w:pos="3600"/>
-          <w:tab w:val="left" w:pos="4320"/>
-          <w:tab w:val="left" w:pos="5040"/>
-          <w:tab w:val="left" w:pos="5760"/>
-          <w:tab w:val="left" w:pos="6480"/>
-          <w:tab w:val="left" w:pos="7200"/>
-          <w:tab w:val="left" w:pos="7920"/>
-        </w:tabs>
-        <w:suppressAutoHyphens/>
         <w:jc w:val="both"/>
         <w:rPr>
           <w:bCs/>
@@ -367,46 +350,35 @@
           <w:bCs/>
           <w:sz w:val="24"/>
         </w:rPr>
-        <w:t xml:space="preserve">Dear </w:t>
-      </w:r>
-      <w:r>
-        <w:rPr>
-          <w:sz w:val="24"/>
-          <w:szCs w:val="24"/>
-        </w:rPr>
-        <w:t>{{ attorney_salutation_with_name_last }}</w:t>
-      </w:r>
-      <w:r>
-        <w:rPr>
-          <w:bCs/>
-          <w:sz w:val="24"/>
-        </w:rPr>
-        <w:t xml:space="preserve">: </w:t>
-      </w:r>
-    </w:p>
-    <w:p>
-      <w:pPr>
-        <w:jc w:val="both"/>
-        <w:rPr>
-          <w:bCs/>
-          <w:sz w:val="24"/>
-        </w:rPr>
-      </w:pPr>
-    </w:p>
-    <w:p>
-      <w:pPr>
-        <w:jc w:val="both"/>
-        <w:rPr>
-          <w:bCs/>
-          <w:sz w:val="24"/>
-        </w:rPr>
-      </w:pPr>
-      <w:r>
-        <w:rPr>
-          <w:bCs/>
-          <w:sz w:val="24"/>
-        </w:rPr>
-        <w:t>Here are the estimates you have requested with respect to the diminution of earning capacity and associated economic impairment sustained by the plaintiff. The following records were considered in connection with the opinion below: {% if ‘LCP’ in rehab_report_types %}</w:t>
+        <w:t xml:space="preserve">Here are the estimates you have requested with respect to the diminution of earning capacity and associated economic impairment sustained by the plaintiff. The following records were considered in connection with the opinion below: {% if </w:t>
+      </w:r>
+      <w:r>
+        <w:rPr>
+          <w:bCs/>
+          <w:sz w:val="24"/>
+        </w:rPr>
+        <w:t>'</w:t>
+      </w:r>
+      <w:r>
+        <w:rPr>
+          <w:bCs/>
+          <w:sz w:val="24"/>
+        </w:rPr>
+        <w:t>LCP</w:t>
+      </w:r>
+      <w:r>
+        <w:rPr>
+          <w:bCs/>
+          <w:sz w:val="24"/>
+        </w:rPr>
+        <w:t>'</w:t>
+      </w:r>
+      <w:r>
+        <w:rPr>
+          <w:bCs/>
+          <w:sz w:val="24"/>
+        </w:rPr>
+        <w:t xml:space="preserve"> in rehab_report_types %}</w:t>
       </w:r>
       <w:r>
         <w:rPr>
@@ -435,7 +407,91 @@
           <w:bCs/>
           <w:sz w:val="24"/>
         </w:rPr>
-        <w:t>, dated {{ LCP_report_date_long }}{% endif %}{% if ‘LCP’ in rehab_report_types and ‘Voc’ in rehab_report_types %} and {% endif %}{% if ‘Voc’ in rehab_report_types %}</w:t>
+        <w:t xml:space="preserve">, dated {{ LCP_report_date_long }}{% endif %}{% if </w:t>
+      </w:r>
+      <w:r>
+        <w:rPr>
+          <w:bCs/>
+          <w:sz w:val="24"/>
+        </w:rPr>
+        <w:t>'</w:t>
+      </w:r>
+      <w:r>
+        <w:rPr>
+          <w:bCs/>
+          <w:sz w:val="24"/>
+        </w:rPr>
+        <w:t>LCP</w:t>
+      </w:r>
+      <w:r>
+        <w:rPr>
+          <w:bCs/>
+          <w:sz w:val="24"/>
+        </w:rPr>
+        <w:t>'</w:t>
+      </w:r>
+      <w:r>
+        <w:rPr>
+          <w:bCs/>
+          <w:sz w:val="24"/>
+        </w:rPr>
+        <w:t xml:space="preserve"> in rehab_report_types and </w:t>
+      </w:r>
+      <w:r>
+        <w:rPr>
+          <w:bCs/>
+          <w:sz w:val="24"/>
+        </w:rPr>
+        <w:t>'</w:t>
+      </w:r>
+      <w:r>
+        <w:rPr>
+          <w:bCs/>
+          <w:sz w:val="24"/>
+        </w:rPr>
+        <w:t>Voc</w:t>
+      </w:r>
+      <w:r>
+        <w:rPr>
+          <w:bCs/>
+          <w:sz w:val="24"/>
+        </w:rPr>
+        <w:t>'</w:t>
+      </w:r>
+      <w:r>
+        <w:rPr>
+          <w:bCs/>
+          <w:sz w:val="24"/>
+        </w:rPr>
+        <w:t xml:space="preserve"> in rehab_report_types %} and {% endif %}{% if </w:t>
+      </w:r>
+      <w:r>
+        <w:rPr>
+          <w:bCs/>
+          <w:sz w:val="24"/>
+        </w:rPr>
+        <w:t>'</w:t>
+      </w:r>
+      <w:r>
+        <w:rPr>
+          <w:bCs/>
+          <w:sz w:val="24"/>
+        </w:rPr>
+        <w:t>Voc</w:t>
+      </w:r>
+      <w:r>
+        <w:rPr>
+          <w:bCs/>
+          <w:sz w:val="24"/>
+        </w:rPr>
+        <w:t>'</w:t>
+      </w:r>
+      <w:r>
+        <w:rPr>
+          <w:bCs/>
+          <w:sz w:val="24"/>
+        </w:rPr>
+        <w:t xml:space="preserve"> in rehab_report_types %}</w:t>
       </w:r>
       <w:r>
         <w:rPr>
@@ -478,22 +534,7 @@
           <w:bCs/>
           <w:sz w:val="24"/>
         </w:rPr>
-        <w:t xml:space="preserve">{% endif %}; </w:t>
-      </w:r>
-      <w:r>
-        <w:rPr>
-          <w:bCs/>
-          <w:sz w:val="24"/>
-          <w:highlight w:val="red"/>
-        </w:rPr>
-        <w:t>{{ rec_rev_list }}</w:t>
-      </w:r>
-      <w:r>
-        <w:rPr>
-          <w:bCs/>
-          <w:sz w:val="24"/>
-        </w:rPr>
-        <w:t>.</w:t>
+        <w:t>{% endif %}; {{ rec_rev_list }}.</w:t>
       </w:r>
     </w:p>
     <w:p>
@@ -578,7 +619,35 @@
           <w:bCs/>
           <w:sz w:val="24"/>
         </w:rPr>
-        <w:t>{%p if base_1_toggle == True and projection_type_toggle == ‘WLE’ %}</w:t>
+        <w:t xml:space="preserve">{%p if base_1_toggle == True and projection_type_toggle == </w:t>
+      </w:r>
+      <w:r>
+        <w:rPr>
+          <w:bCs/>
+          <w:sz w:val="24"/>
+        </w:rPr>
+        <w:t>'</w:t>
+      </w:r>
+      <w:r>
+        <w:rPr>
+          <w:bCs/>
+          <w:sz w:val="24"/>
+        </w:rPr>
+        <w:t>WLE</w:t>
+      </w:r>
+      <w:r>
+        <w:rPr>
+          <w:bCs/>
+          <w:sz w:val="24"/>
+        </w:rPr>
+        <w:t>'</w:t>
+      </w:r>
+      <w:r>
+        <w:rPr>
+          <w:bCs/>
+          <w:sz w:val="24"/>
+        </w:rPr>
+        <w:t xml:space="preserve"> %}</w:t>
       </w:r>
     </w:p>
     <w:p>
@@ -678,35 +747,7 @@
           <w:bCs/>
           <w:sz w:val="24"/>
         </w:rPr>
-        <w:t xml:space="preserve">{%p if </w:t>
-      </w:r>
-      <w:r>
-        <w:rPr>
-          <w:bCs/>
-          <w:sz w:val="24"/>
-        </w:rPr>
-        <w:t>credit</w:t>
-      </w:r>
-      <w:r>
-        <w:rPr>
-          <w:bCs/>
-          <w:sz w:val="24"/>
-        </w:rPr>
-        <w:t xml:space="preserve">1_toggle == False and </w:t>
-      </w:r>
-      <w:r>
-        <w:rPr>
-          <w:bCs/>
-          <w:sz w:val="24"/>
-        </w:rPr>
-        <w:t>credit</w:t>
-      </w:r>
-      <w:r>
-        <w:rPr>
-          <w:bCs/>
-          <w:sz w:val="24"/>
-        </w:rPr>
-        <w:t>2_toggle == False %}</w:t>
+        <w:t>{%p if credit1_toggle == False and credit2_toggle == False %}</w:t>
       </w:r>
     </w:p>
     <w:p>
@@ -1032,23 +1073,7 @@
           <w:sz w:val="24"/>
           <w:u w:val="single"/>
         </w:rPr>
-        <w:t>{{r b</w:t>
-      </w:r>
-      <w:r>
-        <w:rPr>
-          <w:bCs/>
-          <w:sz w:val="24"/>
-          <w:u w:val="single"/>
-        </w:rPr>
-        <w:t>1</w:t>
-      </w:r>
-      <w:r>
-        <w:rPr>
-          <w:bCs/>
-          <w:sz w:val="24"/>
-          <w:u w:val="single"/>
-        </w:rPr>
-        <w:t>e_WLE_pretrial_benefits_adj }}</w:t>
+        <w:t>{{r b1e_WLE_pretrial_benefits_adj }}</w:t>
       </w:r>
     </w:p>
     <w:p>
@@ -1128,36 +1153,7 @@
           <w:bCs/>
           <w:sz w:val="24"/>
         </w:rPr>
-        <w:lastRenderedPageBreak/>
-        <w:t xml:space="preserve">{%p if </w:t>
-      </w:r>
-      <w:r>
-        <w:rPr>
-          <w:bCs/>
-          <w:sz w:val="24"/>
-        </w:rPr>
-        <w:t>credit</w:t>
-      </w:r>
-      <w:r>
-        <w:rPr>
-          <w:bCs/>
-          <w:sz w:val="24"/>
-        </w:rPr>
-        <w:t xml:space="preserve">1_toggle == False and </w:t>
-      </w:r>
-      <w:r>
-        <w:rPr>
-          <w:bCs/>
-          <w:sz w:val="24"/>
-        </w:rPr>
-        <w:t>credit</w:t>
-      </w:r>
-      <w:r>
-        <w:rPr>
-          <w:bCs/>
-          <w:sz w:val="24"/>
-        </w:rPr>
-        <w:t>2_toggle == False %}</w:t>
+        <w:t>{%p if credit1_toggle == False and credit2_toggle == False %}</w:t>
       </w:r>
     </w:p>
     <w:p>
@@ -1193,6 +1189,7 @@
           <w:bCs/>
           <w:sz w:val="24"/>
         </w:rPr>
+        <w:lastRenderedPageBreak/>
         <w:t xml:space="preserve">Without return to gainful employment, the loss from trial is </w:t>
       </w:r>
       <w:r>
@@ -1256,21 +1253,7 @@
           <w:bCs/>
           <w:sz w:val="24"/>
         </w:rPr>
-        <w:t xml:space="preserve">{%p if </w:t>
-      </w:r>
-      <w:r>
-        <w:rPr>
-          <w:bCs/>
-          <w:sz w:val="24"/>
-        </w:rPr>
-        <w:t>credit</w:t>
-      </w:r>
-      <w:r>
-        <w:rPr>
-          <w:bCs/>
-          <w:sz w:val="24"/>
-        </w:rPr>
-        <w:t>1_toggle == True %}</w:t>
+        <w:t>{%p if credit1_toggle == True %}</w:t>
       </w:r>
     </w:p>
     <w:p>
@@ -1305,21 +1288,7 @@
           <w:bCs/>
           <w:sz w:val="24"/>
         </w:rPr>
-        <w:t xml:space="preserve">After credit for {{ </w:t>
-      </w:r>
-      <w:r>
-        <w:rPr>
-          <w:bCs/>
-          <w:sz w:val="24"/>
-        </w:rPr>
-        <w:t>credit</w:t>
-      </w:r>
-      <w:r>
-        <w:rPr>
-          <w:bCs/>
-          <w:sz w:val="24"/>
-        </w:rPr>
-        <w:t>1_WLE_posttrial_adj }},</w:t>
+        <w:t>After credit for {{ credit1_WLE_posttrial_adj }},</w:t>
       </w:r>
       <w:r>
         <w:rPr>
@@ -1429,21 +1398,7 @@
           <w:bCs/>
           <w:sz w:val="24"/>
         </w:rPr>
-        <w:t xml:space="preserve">{%p if </w:t>
-      </w:r>
-      <w:r>
-        <w:rPr>
-          <w:bCs/>
-          <w:sz w:val="24"/>
-        </w:rPr>
-        <w:t>credit</w:t>
-      </w:r>
-      <w:r>
-        <w:rPr>
-          <w:bCs/>
-          <w:sz w:val="24"/>
-        </w:rPr>
-        <w:t>2_toggle == True %}</w:t>
+        <w:t>{%p if credit2_toggle == True %}</w:t>
       </w:r>
     </w:p>
     <w:p>
@@ -1478,21 +1433,7 @@
           <w:bCs/>
           <w:sz w:val="24"/>
         </w:rPr>
-        <w:t xml:space="preserve">After credit for {{ </w:t>
-      </w:r>
-      <w:r>
-        <w:rPr>
-          <w:bCs/>
-          <w:sz w:val="24"/>
-        </w:rPr>
-        <w:t>credit</w:t>
-      </w:r>
-      <w:r>
-        <w:rPr>
-          <w:bCs/>
-          <w:sz w:val="24"/>
-        </w:rPr>
-        <w:t xml:space="preserve">2_WLE_posttrial_adj }}, the loss from trial is </w:t>
+        <w:t xml:space="preserve">After credit for {{ credit2_WLE_posttrial_adj }}, the loss from trial is </w:t>
       </w:r>
       <w:r>
         <w:rPr>
@@ -1773,21 +1714,7 @@
           <w:bCs/>
           <w:sz w:val="24"/>
         </w:rPr>
-        <w:t>Benefits loss from trial is {{r b</w:t>
-      </w:r>
-      <w:r>
-        <w:rPr>
-          <w:bCs/>
-          <w:sz w:val="24"/>
-        </w:rPr>
-        <w:t>1</w:t>
-      </w:r>
-      <w:r>
-        <w:rPr>
-          <w:bCs/>
-          <w:sz w:val="24"/>
-        </w:rPr>
-        <w:t>e_WLE_posttrial_benefits_adj }}</w:t>
+        <w:t>Benefits loss from trial is {{r b1e_WLE_posttrial_benefits_adj }}</w:t>
       </w:r>
     </w:p>
     <w:p>
@@ -1855,7 +1782,35 @@
           <w:bCs/>
           <w:sz w:val="24"/>
         </w:rPr>
-        <w:t>{%p if ‘LCP’ in rehab_report_types %}</w:t>
+        <w:t xml:space="preserve">{%p if </w:t>
+      </w:r>
+      <w:r>
+        <w:rPr>
+          <w:bCs/>
+          <w:sz w:val="24"/>
+        </w:rPr>
+        <w:t>'</w:t>
+      </w:r>
+      <w:r>
+        <w:rPr>
+          <w:bCs/>
+          <w:sz w:val="24"/>
+        </w:rPr>
+        <w:t>LCP</w:t>
+      </w:r>
+      <w:r>
+        <w:rPr>
+          <w:bCs/>
+          <w:sz w:val="24"/>
+        </w:rPr>
+        <w:t>'</w:t>
+      </w:r>
+      <w:r>
+        <w:rPr>
+          <w:bCs/>
+          <w:sz w:val="24"/>
+        </w:rPr>
+        <w:t xml:space="preserve"> in rehab_report_types %}</w:t>
       </w:r>
     </w:p>
     <w:p>
@@ -1995,7 +1950,35 @@
           <w:bCs/>
           <w:sz w:val="24"/>
         </w:rPr>
-        <w:t>{%p if base_2_toggle == True and projection_type_toggle == ‘WLE’ %}</w:t>
+        <w:t xml:space="preserve">{%p if base_2_toggle == True and projection_type_toggle == </w:t>
+      </w:r>
+      <w:r>
+        <w:rPr>
+          <w:bCs/>
+          <w:sz w:val="24"/>
+        </w:rPr>
+        <w:t>'</w:t>
+      </w:r>
+      <w:r>
+        <w:rPr>
+          <w:bCs/>
+          <w:sz w:val="24"/>
+        </w:rPr>
+        <w:t>WLE</w:t>
+      </w:r>
+      <w:r>
+        <w:rPr>
+          <w:bCs/>
+          <w:sz w:val="24"/>
+        </w:rPr>
+        <w:t>'</w:t>
+      </w:r>
+      <w:r>
+        <w:rPr>
+          <w:bCs/>
+          <w:sz w:val="24"/>
+        </w:rPr>
+        <w:t xml:space="preserve"> %}</w:t>
       </w:r>
     </w:p>
     <w:p>
@@ -2095,35 +2078,7 @@
           <w:bCs/>
           <w:sz w:val="24"/>
         </w:rPr>
-        <w:t xml:space="preserve">{%p if </w:t>
-      </w:r>
-      <w:r>
-        <w:rPr>
-          <w:bCs/>
-          <w:sz w:val="24"/>
-        </w:rPr>
-        <w:t>credit</w:t>
-      </w:r>
-      <w:r>
-        <w:rPr>
-          <w:bCs/>
-          <w:sz w:val="24"/>
-        </w:rPr>
-        <w:t xml:space="preserve">1_toggle == False and </w:t>
-      </w:r>
-      <w:r>
-        <w:rPr>
-          <w:bCs/>
-          <w:sz w:val="24"/>
-        </w:rPr>
-        <w:t>credit</w:t>
-      </w:r>
-      <w:r>
-        <w:rPr>
-          <w:bCs/>
-          <w:sz w:val="24"/>
-        </w:rPr>
-        <w:t>2_toggle == False %}</w:t>
+        <w:t>{%p if credit1_toggle == False and credit2_toggle == False %}</w:t>
       </w:r>
     </w:p>
     <w:p>
@@ -2264,7 +2219,6 @@
         <w:rPr>
           <w:bCs/>
           <w:sz w:val="24"/>
-          <w:highlight w:val="red"/>
           <w:u w:val="single"/>
         </w:rPr>
         <w:t>{{r b2e_WLE_pretrial_EFC_adj }}</w:t>
@@ -2336,7 +2290,6 @@
         <w:rPr>
           <w:bCs/>
           <w:sz w:val="24"/>
-          <w:highlight w:val="red"/>
           <w:u w:val="single"/>
         </w:rPr>
         <w:t>{{r b2e_WLE_pretrial_meals_adj }}</w:t>
@@ -2484,35 +2437,7 @@
           <w:bCs/>
           <w:sz w:val="24"/>
         </w:rPr>
-        <w:t xml:space="preserve">{%p if </w:t>
-      </w:r>
-      <w:r>
-        <w:rPr>
-          <w:bCs/>
-          <w:sz w:val="24"/>
-        </w:rPr>
-        <w:t>credit</w:t>
-      </w:r>
-      <w:r>
-        <w:rPr>
-          <w:bCs/>
-          <w:sz w:val="24"/>
-        </w:rPr>
-        <w:t xml:space="preserve">1_toggle == False and </w:t>
-      </w:r>
-      <w:r>
-        <w:rPr>
-          <w:bCs/>
-          <w:sz w:val="24"/>
-        </w:rPr>
-        <w:t>credit</w:t>
-      </w:r>
-      <w:r>
-        <w:rPr>
-          <w:bCs/>
-          <w:sz w:val="24"/>
-        </w:rPr>
-        <w:t>2_toggle == False %}</w:t>
+        <w:t>{%p if credit1_toggle == False and credit2_toggle == False %}</w:t>
       </w:r>
     </w:p>
     <w:p>
@@ -2614,21 +2539,7 @@
           <w:bCs/>
           <w:sz w:val="24"/>
         </w:rPr>
-        <w:t xml:space="preserve">{%p if </w:t>
-      </w:r>
-      <w:r>
-        <w:rPr>
-          <w:bCs/>
-          <w:sz w:val="24"/>
-        </w:rPr>
-        <w:t>credit</w:t>
-      </w:r>
-      <w:r>
-        <w:rPr>
-          <w:bCs/>
-          <w:sz w:val="24"/>
-        </w:rPr>
-        <w:t>1_toggle == True %}</w:t>
+        <w:t>{%p if credit1_toggle == True %}</w:t>
       </w:r>
     </w:p>
     <w:p>
@@ -2663,38 +2574,7 @@
           <w:bCs/>
           <w:sz w:val="24"/>
         </w:rPr>
-        <w:t xml:space="preserve">After credit for </w:t>
-      </w:r>
-      <w:r>
-        <w:rPr>
-          <w:bCs/>
-          <w:sz w:val="24"/>
-          <w:highlight w:val="red"/>
-        </w:rPr>
-        <w:t xml:space="preserve">{{ </w:t>
-      </w:r>
-      <w:r>
-        <w:rPr>
-          <w:bCs/>
-          <w:sz w:val="24"/>
-          <w:highlight w:val="red"/>
-        </w:rPr>
-        <w:t>credit</w:t>
-      </w:r>
-      <w:r>
-        <w:rPr>
-          <w:bCs/>
-          <w:sz w:val="24"/>
-          <w:highlight w:val="red"/>
-        </w:rPr>
-        <w:t>1_WLE_posttrial_adj }}</w:t>
-      </w:r>
-      <w:r>
-        <w:rPr>
-          <w:bCs/>
-          <w:sz w:val="24"/>
-        </w:rPr>
-        <w:t xml:space="preserve">, the loss from trial is </w:t>
+        <w:t xml:space="preserve">After credit for {{ credit1_WLE_posttrial_adj }}, the loss from trial is </w:t>
       </w:r>
       <w:r>
         <w:rPr>
@@ -2760,21 +2640,7 @@
           <w:bCs/>
           <w:sz w:val="24"/>
         </w:rPr>
-        <w:t xml:space="preserve">{%p if </w:t>
-      </w:r>
-      <w:r>
-        <w:rPr>
-          <w:bCs/>
-          <w:sz w:val="24"/>
-        </w:rPr>
-        <w:t>credit</w:t>
-      </w:r>
-      <w:r>
-        <w:rPr>
-          <w:bCs/>
-          <w:sz w:val="24"/>
-        </w:rPr>
-        <w:t>2_toggle == True %}</w:t>
+        <w:t>{%p if credit2_toggle == True %}</w:t>
       </w:r>
     </w:p>
     <w:p>
@@ -2809,38 +2675,7 @@
           <w:bCs/>
           <w:sz w:val="24"/>
         </w:rPr>
-        <w:t xml:space="preserve">After credit for </w:t>
-      </w:r>
-      <w:r>
-        <w:rPr>
-          <w:bCs/>
-          <w:sz w:val="24"/>
-          <w:highlight w:val="red"/>
-        </w:rPr>
-        <w:t xml:space="preserve">{{ </w:t>
-      </w:r>
-      <w:r>
-        <w:rPr>
-          <w:bCs/>
-          <w:sz w:val="24"/>
-          <w:highlight w:val="red"/>
-        </w:rPr>
-        <w:t>credit</w:t>
-      </w:r>
-      <w:r>
-        <w:rPr>
-          <w:bCs/>
-          <w:sz w:val="24"/>
-          <w:highlight w:val="red"/>
-        </w:rPr>
-        <w:t>2_WLE_posttrial_adj }}</w:t>
-      </w:r>
-      <w:r>
-        <w:rPr>
-          <w:bCs/>
-          <w:sz w:val="24"/>
-        </w:rPr>
-        <w:t xml:space="preserve"> (high post-trail EC), the loss from trial is </w:t>
+        <w:t xml:space="preserve">After credit for {{ credit2_WLE_posttrial_adj }} (high post-trail EC), the loss from trial is </w:t>
       </w:r>
       <w:r>
         <w:rPr>
@@ -2999,7 +2834,6 @@
         <w:rPr>
           <w:bCs/>
           <w:sz w:val="24"/>
-          <w:highlight w:val="red"/>
           <w:u w:val="single"/>
         </w:rPr>
         <w:t>{{r b2e_WLE_posttrial_meals_adj }}</w:t>
@@ -3095,21 +2929,7 @@
           <w:bCs/>
           <w:sz w:val="24"/>
         </w:rPr>
-        <w:t xml:space="preserve">Benefits loss </w:t>
-      </w:r>
-      <w:r>
-        <w:rPr>
-          <w:bCs/>
-          <w:sz w:val="24"/>
-        </w:rPr>
-        <w:t>from</w:t>
-      </w:r>
-      <w:r>
-        <w:rPr>
-          <w:bCs/>
-          <w:sz w:val="24"/>
-        </w:rPr>
-        <w:t xml:space="preserve"> trial is {{r b2e_WLE_posttrial_benefits_adj }}</w:t>
+        <w:t>Benefits loss from trial is {{r b2e_WLE_posttrial_benefits_adj }}</w:t>
       </w:r>
     </w:p>
     <w:p>
@@ -3152,7 +2972,35 @@
           <w:bCs/>
           <w:sz w:val="24"/>
         </w:rPr>
-        <w:t>{%p if ‘LCP’ in rehab_report_types %}</w:t>
+        <w:t xml:space="preserve">{%p if </w:t>
+      </w:r>
+      <w:r>
+        <w:rPr>
+          <w:bCs/>
+          <w:sz w:val="24"/>
+        </w:rPr>
+        <w:t>'</w:t>
+      </w:r>
+      <w:r>
+        <w:rPr>
+          <w:bCs/>
+          <w:sz w:val="24"/>
+        </w:rPr>
+        <w:t>LCP</w:t>
+      </w:r>
+      <w:r>
+        <w:rPr>
+          <w:bCs/>
+          <w:sz w:val="24"/>
+        </w:rPr>
+        <w:t>'</w:t>
+      </w:r>
+      <w:r>
+        <w:rPr>
+          <w:bCs/>
+          <w:sz w:val="24"/>
+        </w:rPr>
+        <w:t xml:space="preserve"> in rehab_report_types %}</w:t>
       </w:r>
     </w:p>
     <w:p>
@@ -3792,35 +3640,7 @@
           <w:bCs/>
           <w:sz w:val="24"/>
         </w:rPr>
-        <w:t xml:space="preserve">{% if base_1_toggle == </w:t>
-      </w:r>
-      <w:r>
-        <w:rPr>
-          <w:bCs/>
-          <w:sz w:val="24"/>
-        </w:rPr>
-        <w:t>True</w:t>
-      </w:r>
-      <w:r>
-        <w:rPr>
-          <w:bCs/>
-          <w:sz w:val="24"/>
-        </w:rPr>
-        <w:t xml:space="preserve"> and base_2_toggle == </w:t>
-      </w:r>
-      <w:r>
-        <w:rPr>
-          <w:bCs/>
-          <w:sz w:val="24"/>
-        </w:rPr>
-        <w:t>False</w:t>
-      </w:r>
-      <w:r>
-        <w:rPr>
-          <w:bCs/>
-          <w:sz w:val="24"/>
-        </w:rPr>
-        <w:t xml:space="preserve"> %}</w:t>
+        <w:t>{% if base_1_toggle == True and base_2_toggle == False %}</w:t>
       </w:r>
       <w:r>
         <w:rPr>
@@ -3836,63 +3656,7 @@
           <w:bCs/>
           <w:sz w:val="24"/>
         </w:rPr>
-        <w:t xml:space="preserve"> of </w:t>
-      </w:r>
-      <w:r>
-        <w:rPr>
-          <w:bCs/>
-          <w:sz w:val="24"/>
-        </w:rPr>
-        <w:t>{{ b1e_WLE_earnings }}</w:t>
-      </w:r>
-      <w:r>
-        <w:rPr>
-          <w:bCs/>
-          <w:sz w:val="24"/>
-        </w:rPr>
-        <w:t xml:space="preserve"> is</w:t>
-      </w:r>
-      <w:r>
-        <w:rPr>
-          <w:bCs/>
-          <w:sz w:val="24"/>
-        </w:rPr>
-        <w:t>{% endif %}</w:t>
-      </w:r>
-      <w:r>
-        <w:rPr>
-          <w:bCs/>
-          <w:sz w:val="24"/>
-        </w:rPr>
-        <w:t xml:space="preserve">{% if base_1_toggle == </w:t>
-      </w:r>
-      <w:r>
-        <w:rPr>
-          <w:bCs/>
-          <w:sz w:val="24"/>
-        </w:rPr>
-        <w:t>True</w:t>
-      </w:r>
-      <w:r>
-        <w:rPr>
-          <w:bCs/>
-          <w:sz w:val="24"/>
-        </w:rPr>
-        <w:t xml:space="preserve"> and base_2_toggle == </w:t>
-      </w:r>
-      <w:r>
-        <w:rPr>
-          <w:bCs/>
-          <w:sz w:val="24"/>
-        </w:rPr>
-        <w:t>True</w:t>
-      </w:r>
-      <w:r>
-        <w:rPr>
-          <w:bCs/>
-          <w:sz w:val="24"/>
-        </w:rPr>
-        <w:t xml:space="preserve"> %}</w:t>
+        <w:t xml:space="preserve"> of {{ b1e_WLE_earnings }} is{% endif %}{% if base_1_toggle == True and base_2_toggle == True %}</w:t>
       </w:r>
       <w:r>
         <w:rPr>
@@ -3916,21 +3680,7 @@
           <w:bCs/>
           <w:sz w:val="24"/>
         </w:rPr>
-        <w:t xml:space="preserve"> of {{ b1e_WLE_earnings }}</w:t>
-      </w:r>
-      <w:r>
-        <w:rPr>
-          <w:bCs/>
-          <w:sz w:val="24"/>
-        </w:rPr>
-        <w:t xml:space="preserve"> and </w:t>
-      </w:r>
-      <w:r>
-        <w:rPr>
-          <w:bCs/>
-          <w:sz w:val="24"/>
-        </w:rPr>
-        <w:t>{{ b2e_WLE_earnings }}</w:t>
+        <w:t xml:space="preserve"> of {{ b1e_WLE_earnings }} and {{ b2e_WLE_earnings }}</w:t>
       </w:r>
       <w:r>
         <w:rPr>
@@ -3945,35 +3695,7 @@
           <w:bCs/>
           <w:sz w:val="24"/>
         </w:rPr>
-        <w:t>{% endif %}</w:t>
-      </w:r>
-      <w:r>
-        <w:rPr>
-          <w:bCs/>
-          <w:sz w:val="24"/>
-        </w:rPr>
-        <w:t xml:space="preserve"> employed in the estimate of earning capacity losses below. </w:t>
-      </w:r>
-      <w:r>
-        <w:rPr>
-          <w:bCs/>
-          <w:sz w:val="24"/>
-        </w:rPr>
-        <w:t xml:space="preserve">{% if taxed_toggle == </w:t>
-      </w:r>
-      <w:r>
-        <w:rPr>
-          <w:bCs/>
-          <w:sz w:val="24"/>
-        </w:rPr>
-        <w:t>True</w:t>
-      </w:r>
-      <w:r>
-        <w:rPr>
-          <w:bCs/>
-          <w:sz w:val="24"/>
-        </w:rPr>
-        <w:t xml:space="preserve"> %} </w:t>
+        <w:t xml:space="preserve">{% endif %} employed in the estimate of earning capacity losses below. {% if taxed_toggle == True %} </w:t>
       </w:r>
       <w:r>
         <w:rPr>
@@ -3988,14 +3710,7 @@
           <w:bCs/>
           <w:sz w:val="24"/>
         </w:rPr>
-        <w:t>{{ eff_tax_rate }}.</w:t>
-      </w:r>
-      <w:r>
-        <w:rPr>
-          <w:bCs/>
-          <w:sz w:val="24"/>
-        </w:rPr>
-        <w:t>{% endif %}</w:t>
+        <w:t>{{ eff_tax_rate }}.{% endif %}</w:t>
       </w:r>
     </w:p>
     <w:p>
@@ -4195,57 +3910,7 @@
                 <w:szCs w:val="24"/>
                 <w:highlight w:val="red"/>
               </w:rPr>
-              <w:t xml:space="preserve">{% if credit1_toggle == </w:t>
-            </w:r>
-            <w:r>
-              <w:rPr>
-                <w:color w:val="000000"/>
-                <w:spacing w:val="0"/>
-                <w:sz w:val="24"/>
-                <w:szCs w:val="24"/>
-                <w:highlight w:val="red"/>
-              </w:rPr>
-              <w:t>True</w:t>
-            </w:r>
-            <w:r>
-              <w:rPr>
-                <w:color w:val="000000"/>
-                <w:spacing w:val="0"/>
-                <w:sz w:val="24"/>
-                <w:szCs w:val="24"/>
-                <w:highlight w:val="red"/>
-              </w:rPr>
-              <w:t xml:space="preserve"> or credit2_toggle == </w:t>
-            </w:r>
-            <w:r>
-              <w:rPr>
-                <w:color w:val="000000"/>
-                <w:spacing w:val="0"/>
-                <w:sz w:val="24"/>
-                <w:szCs w:val="24"/>
-                <w:highlight w:val="red"/>
-              </w:rPr>
-              <w:t>True</w:t>
-            </w:r>
-            <w:r>
-              <w:rPr>
-                <w:color w:val="000000"/>
-                <w:spacing w:val="0"/>
-                <w:sz w:val="24"/>
-                <w:szCs w:val="24"/>
-                <w:highlight w:val="red"/>
-              </w:rPr>
-              <w:t xml:space="preserve"> %}</w:t>
-            </w:r>
-            <w:r>
-              <w:rPr>
-                <w:color w:val="000000"/>
-                <w:spacing w:val="0"/>
-                <w:sz w:val="24"/>
-                <w:szCs w:val="24"/>
-                <w:highlight w:val="red"/>
-              </w:rPr>
-              <w:t>Alternative</w:t>
+              <w:t>{% if credit1_toggle == True or credit2_toggle == True %}Alternative</w:t>
             </w:r>
             <w:r>
               <w:rPr>
@@ -4288,11 +3953,13 @@
                 <w:spacing w:val="0"/>
                 <w:sz w:val="24"/>
                 <w:szCs w:val="24"/>
-                <w:highlight w:val="red"/>
-              </w:rPr>
-              <w:t>{% if</w:t>
+              </w:rPr>
+              <w:t>{% if credit1_toggle == True %}{{ credit1_WLE_earnings }}{% endif %}</w:t>
             </w:r>
-            <w:r>
+          </w:p>
+          <w:p>
+            <w:pPr>
+              <w:jc w:val="center"/>
               <w:rPr>
                 <w:color w:val="000000"/>
                 <w:spacing w:val="0"/>
@@ -4300,8 +3967,7 @@
                 <w:szCs w:val="24"/>
                 <w:highlight w:val="red"/>
               </w:rPr>
-              <w:t xml:space="preserve"> credit1_toggle == </w:t>
-            </w:r>
+            </w:pPr>
             <w:r>
               <w:rPr>
                 <w:color w:val="000000"/>
@@ -4310,117 +3976,7 @@
                 <w:szCs w:val="24"/>
                 <w:highlight w:val="red"/>
               </w:rPr>
-              <w:t>True</w:t>
-            </w:r>
-            <w:r>
-              <w:rPr>
-                <w:color w:val="000000"/>
-                <w:spacing w:val="0"/>
-                <w:sz w:val="24"/>
-                <w:szCs w:val="24"/>
-                <w:highlight w:val="red"/>
-              </w:rPr>
-              <w:t xml:space="preserve"> %}</w:t>
-            </w:r>
-            <w:r>
-              <w:rPr>
-                <w:color w:val="000000"/>
-                <w:spacing w:val="0"/>
-                <w:sz w:val="24"/>
-                <w:szCs w:val="24"/>
-                <w:highlight w:val="red"/>
-              </w:rPr>
-              <w:t xml:space="preserve">{{ </w:t>
-            </w:r>
-            <w:r>
-              <w:rPr>
-                <w:color w:val="000000"/>
-                <w:spacing w:val="0"/>
-                <w:sz w:val="24"/>
-                <w:szCs w:val="24"/>
-              </w:rPr>
-              <w:t>credit1_WLE_earnings</w:t>
-            </w:r>
-            <w:r>
-              <w:rPr>
-                <w:color w:val="000000"/>
-                <w:spacing w:val="0"/>
-                <w:sz w:val="24"/>
-                <w:szCs w:val="24"/>
-              </w:rPr>
-              <w:t xml:space="preserve"> </w:t>
-            </w:r>
-            <w:r>
-              <w:rPr>
-                <w:color w:val="000000"/>
-                <w:spacing w:val="0"/>
-                <w:sz w:val="24"/>
-                <w:szCs w:val="24"/>
-                <w:highlight w:val="red"/>
-              </w:rPr>
-              <w:t>}}</w:t>
-            </w:r>
-            <w:r>
-              <w:rPr>
-                <w:color w:val="000000"/>
-                <w:spacing w:val="0"/>
-                <w:sz w:val="24"/>
-                <w:szCs w:val="24"/>
-                <w:highlight w:val="red"/>
-              </w:rPr>
-              <w:t>{% endif %}</w:t>
-            </w:r>
-          </w:p>
-          <w:p>
-            <w:pPr>
-              <w:jc w:val="center"/>
-              <w:rPr>
-                <w:color w:val="000000"/>
-                <w:spacing w:val="0"/>
-                <w:sz w:val="24"/>
-                <w:szCs w:val="24"/>
-                <w:highlight w:val="red"/>
-              </w:rPr>
-            </w:pPr>
-            <w:r>
-              <w:rPr>
-                <w:color w:val="000000"/>
-                <w:spacing w:val="0"/>
-                <w:sz w:val="24"/>
-                <w:szCs w:val="24"/>
-                <w:highlight w:val="red"/>
-              </w:rPr>
-              <w:t xml:space="preserve">{% if credit2_toggle == </w:t>
-            </w:r>
-            <w:r>
-              <w:rPr>
-                <w:color w:val="000000"/>
-                <w:spacing w:val="0"/>
-                <w:sz w:val="24"/>
-                <w:szCs w:val="24"/>
-                <w:highlight w:val="red"/>
-              </w:rPr>
-              <w:t>True</w:t>
-            </w:r>
-            <w:r>
-              <w:rPr>
-                <w:color w:val="000000"/>
-                <w:spacing w:val="0"/>
-                <w:sz w:val="24"/>
-                <w:szCs w:val="24"/>
-                <w:highlight w:val="red"/>
-              </w:rPr>
-              <w:t xml:space="preserve"> %}</w:t>
-            </w:r>
-            <w:r>
-              <w:rPr>
-                <w:color w:val="000000"/>
-                <w:spacing w:val="0"/>
-                <w:sz w:val="24"/>
-                <w:szCs w:val="24"/>
-                <w:highlight w:val="red"/>
-              </w:rPr>
-              <w:t>{{</w:t>
+              <w:t>{% if credit2_toggle == True %}{{</w:t>
             </w:r>
           </w:p>
           <w:p>
@@ -4463,17 +4019,7 @@
                 <w:szCs w:val="24"/>
                 <w:highlight w:val="red"/>
               </w:rPr>
-              <w:t>}}</w:t>
-            </w:r>
-            <w:r>
-              <w:rPr>
-                <w:color w:val="000000"/>
-                <w:spacing w:val="0"/>
-                <w:sz w:val="24"/>
-                <w:szCs w:val="24"/>
-                <w:highlight w:val="red"/>
-              </w:rPr>
-              <w:t>{% endif %}</w:t>
+              <w:t>}}{% endif %}</w:t>
             </w:r>
           </w:p>
         </w:tc>
@@ -4566,37 +4112,7 @@
           <w:bCs/>
           <w:sz w:val="24"/>
         </w:rPr>
-        <w:t xml:space="preserve"> multiplying the earnings base by the time period from the accident to the trial. The Vocational Evaluation states </w:t>
-      </w:r>
-      <w:r>
-        <w:rPr>
-          <w:bCs/>
-          <w:sz w:val="24"/>
-          <w:highlight w:val="yellow"/>
-        </w:rPr>
-        <w:t>{{ claimant_salutation_with_name_last }}</w:t>
-      </w:r>
-      <w:r>
-        <w:rPr>
-          <w:bCs/>
-          <w:sz w:val="24"/>
-        </w:rPr>
-        <w:t xml:space="preserve"> had the potential to reach a median earnings rate of </w:t>
-      </w:r>
-      <w:r>
-        <w:rPr>
-          <w:bCs/>
-          <w:sz w:val="24"/>
-          <w:highlight w:val="yellow"/>
-        </w:rPr>
-        <w:t>{{ b2e_WLE_earnings }}</w:t>
-      </w:r>
-      <w:r>
-        <w:rPr>
-          <w:bCs/>
-          <w:sz w:val="24"/>
-        </w:rPr>
-        <w:t xml:space="preserve"> per year. </w:t>
+        <w:t xml:space="preserve"> multiplying the earnings base by the time period from the accident to the trial. The Vocational Evaluation states {{ claimant_salutation_with_name_last }} had the potential to reach a median earnings rate of {{ b2e_WLE_earnings }} per year. </w:t>
       </w:r>
       <w:r>
         <w:rPr>
@@ -4674,21 +4190,7 @@
           <w:bCs/>
           <w:sz w:val="24"/>
         </w:rPr>
-        <w:t xml:space="preserve"> indicates that the plaintiff was working as </w:t>
-      </w:r>
-      <w:r>
-        <w:rPr>
-          <w:bCs/>
-          <w:sz w:val="24"/>
-        </w:rPr>
-        <w:t>a</w:t>
-      </w:r>
-      <w:r>
-        <w:rPr>
-          <w:bCs/>
-          <w:sz w:val="24"/>
-        </w:rPr>
-        <w:t xml:space="preserve"> {{ job_title_1 }} for {{ claimant_employer }} at the time of the accident. </w:t>
+        <w:t xml:space="preserve"> indicates that the plaintiff was working as a {{ job_title_1 }} for {{ claimant_employer }} at the time of the accident. </w:t>
       </w:r>
       <w:r>
         <w:rPr>
@@ -4703,15 +4205,7 @@
           <w:bCs/>
           <w:sz w:val="24"/>
         </w:rPr>
-        <w:t xml:space="preserve"> </w:t>
-      </w:r>
-      <w:r>
-        <w:rPr>
-          <w:bCs/>
-          <w:sz w:val="24"/>
-          <w:highlight w:val="yellow"/>
-        </w:rPr>
-        <w:t xml:space="preserve">{{ claimant_salutation_with_name_last }} </w:t>
+        <w:t xml:space="preserve"> {{ claimant_salutation_with_name_last }} </w:t>
       </w:r>
       <w:r>
         <w:rPr>
@@ -4734,7 +4228,23 @@
           <w:sz w:val="24"/>
           <w:highlight w:val="green"/>
         </w:rPr>
-        <w:t xml:space="preserve">per hour. A notice documenting an initial payment for worker’s compensation indicates a weekly wage of </w:t>
+        <w:t>per hour. A notice documenting an initial payment for worker</w:t>
+      </w:r>
+      <w:r>
+        <w:rPr>
+          <w:bCs/>
+          <w:sz w:val="24"/>
+          <w:highlight w:val="green"/>
+        </w:rPr>
+        <w:t>'</w:t>
+      </w:r>
+      <w:r>
+        <w:rPr>
+          <w:bCs/>
+          <w:sz w:val="24"/>
+          <w:highlight w:val="green"/>
+        </w:rPr>
+        <w:t xml:space="preserve">s compensation indicates a weekly wage of </w:t>
       </w:r>
       <w:r>
         <w:rPr>
@@ -4756,21 +4266,7 @@
           <w:bCs/>
           <w:sz w:val="24"/>
         </w:rPr>
-        <w:t xml:space="preserve"> {{ b</w:t>
-      </w:r>
-      <w:r>
-        <w:rPr>
-          <w:bCs/>
-          <w:sz w:val="24"/>
-        </w:rPr>
-        <w:t>1</w:t>
-      </w:r>
-      <w:r>
-        <w:rPr>
-          <w:bCs/>
-          <w:sz w:val="24"/>
-        </w:rPr>
-        <w:t xml:space="preserve">e_WLE_earnings }} </w:t>
+        <w:t xml:space="preserve"> {{ b1e_WLE_earnings }} </w:t>
       </w:r>
       <w:r>
         <w:rPr>
@@ -5146,13 +4642,6 @@
         <w:lastRenderedPageBreak/>
         <w:tab/>
       </w:r>
-      <w:r>
-        <w:rPr>
-          <w:bCs/>
-          <w:sz w:val="24"/>
-        </w:rPr>
-        <w:tab/>
-      </w:r>
     </w:p>
     <w:p>
       <w:pPr>
@@ -5196,35 +4685,7 @@
           <w:bCs/>
           <w:sz w:val="24"/>
         </w:rPr>
-        <w:t xml:space="preserve"> form the basis upon which post-trial earning capacity streams are commuted to present value. The discounting ensures that the lump sum award will dissipate entirely by the end of the calculating period and will be used to replicate the stream of anticipated earning capacity, without windfall to your client. This analysis employs a laddered discount rate approach with rates derived from current rates of interest on AAA-rated municipal bonds ranging from {{ </w:t>
-      </w:r>
-      <w:r>
-        <w:rPr>
-          <w:bCs/>
-          <w:sz w:val="24"/>
-        </w:rPr>
-        <w:t>PV2_WLE_DR_year_min_disc_rate</w:t>
-      </w:r>
-      <w:r>
-        <w:rPr>
-          <w:bCs/>
-          <w:sz w:val="24"/>
-        </w:rPr>
-        <w:t xml:space="preserve"> }}% to {{ </w:t>
-      </w:r>
-      <w:r>
-        <w:rPr>
-          <w:bCs/>
-          <w:sz w:val="24"/>
-        </w:rPr>
-        <w:t>PV2_WLE_DR_year_max_disc_rate</w:t>
-      </w:r>
-      <w:r>
-        <w:rPr>
-          <w:bCs/>
-          <w:sz w:val="24"/>
-        </w:rPr>
-        <w:t xml:space="preserve"> }}%.</w:t>
+        <w:t xml:space="preserve"> form the basis upon which post-trial earning capacity streams are commuted to present value. The discounting ensures that the lump sum award will dissipate entirely by the end of the calculating period and will be used to replicate the stream of anticipated earning capacity, without windfall to your client. This analysis employs a laddered discount rate approach with rates derived from current rates of interest on AAA-rated municipal bonds ranging from {{ PV2_WLE_DR_year_min_disc_rate }}% to {{ PV2_WLE_DR_year_max_disc_rate }}%.</w:t>
       </w:r>
     </w:p>
     <w:p>
@@ -5278,30 +4739,7 @@
           <w:bCs/>
           <w:sz w:val="24"/>
         </w:rPr>
-        <w:t xml:space="preserve"> have been used to adjust the stream of earning capacity. Earnings growth is </w:t>
-      </w:r>
-      <w:r>
-        <w:rPr>
-          <w:bCs/>
-          <w:sz w:val="24"/>
-          <w:highlight w:val="red"/>
-        </w:rPr>
-        <w:t xml:space="preserve">{{ </w:t>
-      </w:r>
-      <w:r>
-        <w:rPr>
-          <w:bCs/>
-          <w:sz w:val="24"/>
-        </w:rPr>
-        <w:t>b1e_WLE_growth_rate</w:t>
-      </w:r>
-      <w:r>
-        <w:rPr>
-          <w:bCs/>
-          <w:sz w:val="24"/>
-          <w:highlight w:val="red"/>
-        </w:rPr>
-        <w:t xml:space="preserve"> }}</w:t>
+        <w:t xml:space="preserve"> have been used to adjust the stream of earning capacity. Earnings growth is {{ b1e_WLE_growth_rate }}</w:t>
       </w:r>
       <w:r>
         <w:rPr>
@@ -5510,37 +4948,8 @@
                 <w:spacing w:val="0"/>
                 <w:sz w:val="24"/>
                 <w:szCs w:val="24"/>
-                <w:highlight w:val="red"/>
-              </w:rPr>
-              <w:t xml:space="preserve">{{ </w:t>
-            </w:r>
-            <w:r>
-              <w:rPr>
-                <w:color w:val="000000"/>
-                <w:spacing w:val="0"/>
-                <w:sz w:val="24"/>
-                <w:szCs w:val="24"/>
-              </w:rPr>
-              <w:t>b1e_WLE_growth_rate</w:t>
-            </w:r>
-            <w:r>
-              <w:rPr>
-                <w:color w:val="000000"/>
-                <w:spacing w:val="0"/>
-                <w:sz w:val="24"/>
-                <w:szCs w:val="24"/>
-              </w:rPr>
-              <w:t xml:space="preserve"> </w:t>
-            </w:r>
-            <w:r>
-              <w:rPr>
-                <w:color w:val="000000"/>
-                <w:spacing w:val="0"/>
-                <w:sz w:val="24"/>
-                <w:szCs w:val="24"/>
-                <w:highlight w:val="red"/>
-              </w:rPr>
-              <w:t>}}</w:t>
+              </w:rPr>
+              <w:t>{{ b1e_WLE_growth_rate }}</w:t>
             </w:r>
           </w:p>
         </w:tc>
@@ -5613,37 +5022,8 @@
                 <w:spacing w:val="0"/>
                 <w:sz w:val="24"/>
                 <w:szCs w:val="24"/>
-                <w:highlight w:val="red"/>
-              </w:rPr>
-              <w:t xml:space="preserve">{{ </w:t>
-            </w:r>
-            <w:r>
-              <w:rPr>
-                <w:color w:val="000000"/>
-                <w:spacing w:val="0"/>
-                <w:sz w:val="24"/>
-                <w:szCs w:val="24"/>
-              </w:rPr>
-              <w:t>credit1_WLE_growth_rate</w:t>
-            </w:r>
-            <w:r>
-              <w:rPr>
-                <w:color w:val="000000"/>
-                <w:spacing w:val="0"/>
-                <w:sz w:val="24"/>
-                <w:szCs w:val="24"/>
-              </w:rPr>
-              <w:t xml:space="preserve"> </w:t>
-            </w:r>
-            <w:r>
-              <w:rPr>
-                <w:color w:val="000000"/>
-                <w:spacing w:val="0"/>
-                <w:sz w:val="24"/>
-                <w:szCs w:val="24"/>
-                <w:highlight w:val="red"/>
-              </w:rPr>
-              <w:t xml:space="preserve">}} </w:t>
+              </w:rPr>
+              <w:t xml:space="preserve">{{ credit1_WLE_growth_rate }} </w:t>
             </w:r>
           </w:p>
         </w:tc>
@@ -5696,15 +5076,7 @@
           <w:bCs/>
           <w:sz w:val="24"/>
         </w:rPr>
-        <w:t>The United States Depart</w:t>
-      </w:r>
-      <w:r>
-        <w:rPr>
-          <w:bCs/>
-          <w:sz w:val="24"/>
-        </w:rPr>
-        <w:softHyphen/>
-        <w:t xml:space="preserve">ment of Commerce and the Bureau of Labor Statistics have compiled data upon which researchers in both the private and public sectors have produced estimates of working life and estimates of average retirement age. An example of the former is Bulletin 2254, published in February 1986, while an example of the latter is an article entitled "The Use of Worklife Tables in Estimates of Lost Earning Capacity," published in April 1983, in the </w:t>
+        <w:t xml:space="preserve">The United States Department of Commerce and the Bureau of Labor Statistics have compiled data upon which researchers in both the private and public sectors have produced estimates of working life and estimates of average retirement age. An example of the former is Bulletin 2254, published in February 1986, while an example of the latter is an article entitled "The Use of Worklife Tables in Estimates of Lost Earning Capacity," published in April 1983, in the </w:t>
       </w:r>
       <w:r>
         <w:rPr>
@@ -5787,21 +5159,7 @@
           <w:bCs/>
           <w:sz w:val="24"/>
         </w:rPr>
-        <w:t xml:space="preserve"> {{ </w:t>
-      </w:r>
-      <w:r>
-        <w:rPr>
-          <w:bCs/>
-          <w:sz w:val="24"/>
-        </w:rPr>
-        <w:t>claimant_LE_at_trial</w:t>
-      </w:r>
-      <w:r>
-        <w:rPr>
-          <w:bCs/>
-          <w:sz w:val="24"/>
-        </w:rPr>
-        <w:t xml:space="preserve"> }}. </w:t>
+        <w:t xml:space="preserve"> {{ claimant_LE_at_trial }}. </w:t>
       </w:r>
       <w:r>
         <w:rPr>
@@ -5816,42 +5174,7 @@
           <w:bCs/>
           <w:sz w:val="24"/>
         </w:rPr>
-        <w:t xml:space="preserve"> {{ </w:t>
-      </w:r>
-      <w:r>
-        <w:rPr>
-          <w:bCs/>
-          <w:sz w:val="24"/>
-        </w:rPr>
-        <w:t>claimant_WLE_from_trial_full</w:t>
-      </w:r>
-      <w:r>
-        <w:rPr>
-          <w:bCs/>
-          <w:sz w:val="24"/>
-        </w:rPr>
-        <w:t xml:space="preserve"> </w:t>
-      </w:r>
-      <w:r>
-        <w:rPr>
-          <w:bCs/>
-          <w:sz w:val="24"/>
-        </w:rPr>
-        <w:t>}}</w:t>
-      </w:r>
-      <w:r>
-        <w:rPr>
-          <w:bCs/>
-          <w:sz w:val="24"/>
-        </w:rPr>
-        <w:t xml:space="preserve"> </w:t>
-      </w:r>
-      <w:r>
-        <w:rPr>
-          <w:bCs/>
-          <w:sz w:val="24"/>
-        </w:rPr>
-        <w:t xml:space="preserve">years from </w:t>
+        <w:t xml:space="preserve"> {{ claimant_WLE_from_trial_full }} years from </w:t>
       </w:r>
       <w:r>
         <w:rPr>
@@ -5866,21 +5189,21 @@
           <w:bCs/>
           <w:sz w:val="24"/>
         </w:rPr>
-        <w:t xml:space="preserve"> according to age and educational attainment. Life expectancy from trial is approximately {{ </w:t>
-      </w:r>
-      <w:r>
-        <w:rPr>
-          <w:bCs/>
-          <w:sz w:val="24"/>
-        </w:rPr>
-        <w:t>claimant_LE_at_trial</w:t>
-      </w:r>
-      <w:r>
-        <w:rPr>
-          <w:bCs/>
-          <w:sz w:val="24"/>
-        </w:rPr>
-        <w:t xml:space="preserve"> }} years for a {{ claimant_gender }} of  the plaintiff’s date of birth, according to the 2023 United States Life Tables, </w:t>
+        <w:t xml:space="preserve"> according to age and educational attainment. Life expectancy from trial is approximately {{ claimant_LE_at_trial }} years for a {{ claimant_gender }} of  the plaintiff</w:t>
+      </w:r>
+      <w:r>
+        <w:rPr>
+          <w:bCs/>
+          <w:sz w:val="24"/>
+        </w:rPr>
+        <w:t>'</w:t>
+      </w:r>
+      <w:r>
+        <w:rPr>
+          <w:bCs/>
+          <w:sz w:val="24"/>
+        </w:rPr>
+        <w:t xml:space="preserve">s date of birth, according to the 2023 United States Life Tables, </w:t>
       </w:r>
       <w:r>
         <w:rPr>
@@ -6043,34 +5366,7 @@
                 <w:sz w:val="24"/>
                 <w:szCs w:val="24"/>
               </w:rPr>
-              <w:t xml:space="preserve">{{ </w:t>
-            </w:r>
-            <w:r>
-              <w:rPr>
-                <w:color w:val="000000"/>
-                <w:spacing w:val="0"/>
-                <w:sz w:val="24"/>
-                <w:szCs w:val="24"/>
-              </w:rPr>
-              <w:t>claimant_WLE_from_trial_full</w:t>
-            </w:r>
-            <w:r>
-              <w:rPr>
-                <w:color w:val="000000"/>
-                <w:spacing w:val="0"/>
-                <w:sz w:val="24"/>
-                <w:szCs w:val="24"/>
-              </w:rPr>
-              <w:t xml:space="preserve"> </w:t>
-            </w:r>
-            <w:r>
-              <w:rPr>
-                <w:color w:val="000000"/>
-                <w:spacing w:val="0"/>
-                <w:sz w:val="24"/>
-                <w:szCs w:val="24"/>
-              </w:rPr>
-              <w:t>}} Years</w:t>
+              <w:t>{{ claimant_WLE_from_trial_full }} Years</w:t>
             </w:r>
           </w:p>
         </w:tc>
@@ -6143,34 +5439,7 @@
                 <w:sz w:val="24"/>
                 <w:szCs w:val="24"/>
               </w:rPr>
-              <w:t xml:space="preserve"> {{ </w:t>
-            </w:r>
-            <w:r>
-              <w:rPr>
-                <w:color w:val="000000"/>
-                <w:spacing w:val="0"/>
-                <w:sz w:val="24"/>
-                <w:szCs w:val="24"/>
-              </w:rPr>
-              <w:t>claimant_LE_at_trial</w:t>
-            </w:r>
-            <w:r>
-              <w:rPr>
-                <w:color w:val="000000"/>
-                <w:spacing w:val="0"/>
-                <w:sz w:val="24"/>
-                <w:szCs w:val="24"/>
-              </w:rPr>
-              <w:t xml:space="preserve"> </w:t>
-            </w:r>
-            <w:r>
-              <w:rPr>
-                <w:color w:val="000000"/>
-                <w:spacing w:val="0"/>
-                <w:sz w:val="24"/>
-                <w:szCs w:val="24"/>
-              </w:rPr>
-              <w:t>}} Years</w:t>
+              <w:t xml:space="preserve"> {{ claimant_LE_at_trial }} Years</w:t>
             </w:r>
           </w:p>
         </w:tc>
@@ -6245,7 +5514,21 @@
           <w:bCs/>
           <w:sz w:val="24"/>
         </w:rPr>
-        <w:t xml:space="preserve"> measures the extent to which the plaintiff’s earning capacity may have been impaired as a result of {{ claimant_gender_possessive }} injury. Wages are reported for alternative occupations on </w:t>
+        <w:t xml:space="preserve"> measures the extent to which the plaintiff</w:t>
+      </w:r>
+      <w:r>
+        <w:rPr>
+          <w:bCs/>
+          <w:sz w:val="24"/>
+        </w:rPr>
+        <w:t>'</w:t>
+      </w:r>
+      <w:r>
+        <w:rPr>
+          <w:bCs/>
+          <w:sz w:val="24"/>
+        </w:rPr>
+        <w:t xml:space="preserve">s earning capacity may have been impaired as a result of {{ claimant_gender_possessive }} injury. Wages are reported for alternative occupations on </w:t>
       </w:r>
       <w:r>
         <w:rPr>
@@ -6334,16 +5617,8 @@
         <w:rPr>
           <w:bCs/>
           <w:sz w:val="24"/>
-          <w:highlight w:val="red"/>
-        </w:rPr>
-        <w:t>{{ b1e_eff_tax_rate }}</w:t>
-      </w:r>
-      <w:r>
-        <w:rPr>
-          <w:bCs/>
-          <w:sz w:val="24"/>
-        </w:rPr>
-        <w:t>%.</w:t>
+        </w:rPr>
+        <w:t>{{ b1e_eff_tax_rate }}%.</w:t>
       </w:r>
     </w:p>
     <w:p>
@@ -6416,41 +5691,7 @@
           <w:sz w:val="24"/>
           <w:szCs w:val="24"/>
         </w:rPr>
-        <w:t xml:space="preserve"> represent payments made in lieu of wages. </w:t>
-      </w:r>
-      <w:r>
-        <w:rPr>
-          <w:bCs/>
-          <w:sz w:val="24"/>
-          <w:szCs w:val="24"/>
-          <w:highlight w:val="yellow"/>
-        </w:rPr>
-        <w:t>{{ claimant_salutation_with_name_last }}</w:t>
-      </w:r>
-      <w:r>
-        <w:rPr>
-          <w:bCs/>
-          <w:sz w:val="24"/>
-          <w:szCs w:val="24"/>
-        </w:rPr>
-        <w:t xml:space="preserve"> worked for </w:t>
-      </w:r>
-      <w:r>
-        <w:rPr>
-          <w:bCs/>
-          <w:sz w:val="24"/>
-          <w:szCs w:val="24"/>
-          <w:highlight w:val="yellow"/>
-        </w:rPr>
-        <w:t>{{ claimant_employer }}</w:t>
-      </w:r>
-      <w:r>
-        <w:rPr>
-          <w:bCs/>
-          <w:sz w:val="24"/>
-          <w:szCs w:val="24"/>
-        </w:rPr>
-        <w:t xml:space="preserve"> at the time of the accident. Estimates from the Employer Cost of Employee Compensation show that, on average, hourly costs for </w:t>
+        <w:t xml:space="preserve"> represent payments made in lieu of wages. {{ claimant_salutation_with_name_last }} worked for {{ claimant_employer }} at the time of the accident. Estimates from the Employer Cost of Employee Compensation show that, on average, hourly costs for </w:t>
       </w:r>
       <w:r>
         <w:rPr>
@@ -6547,7 +5788,15 @@
           <w:highlight w:val="red"/>
           <w:u w:val="single"/>
         </w:rPr>
-        <w:fldChar w:fldCharType="begin"/>
+        <w:t>$73,877</w:t>
+      </w:r>
+      <w:r>
+        <w:rPr>
+          <w:bCs/>
+          <w:sz w:val="24"/>
+          <w:szCs w:val="24"/>
+        </w:rPr>
+        <w:t xml:space="preserve">. The present value of employer fringe contributions is </w:t>
       </w:r>
       <w:r>
         <w:rPr>
@@ -6557,17 +5806,24 @@
           <w:highlight w:val="red"/>
           <w:u w:val="single"/>
         </w:rPr>
-        <w:instrText xml:space="preserve"> DOCVARIABLE "zapLink¦2!1!Loss_to_Trial_Base_one" </w:instrText>
-      </w:r>
-      <w:r>
-        <w:rPr>
-          <w:bCs/>
+        <w:t>$92,569</w:t>
+      </w:r>
+      <w:r>
+        <w:rPr>
+          <w:bCs/>
+          <w:sz w:val="24"/>
+          <w:szCs w:val="24"/>
+        </w:rPr>
+        <w:t xml:space="preserve"> under the base of {{ b1e_WLE_earnings }} or </w:t>
+      </w:r>
+      <w:r>
+        <w:rPr>
           <w:sz w:val="24"/>
           <w:szCs w:val="24"/>
           <w:highlight w:val="red"/>
           <w:u w:val="single"/>
         </w:rPr>
-        <w:fldChar w:fldCharType="separate"/>
+        <w:t>$</w:t>
       </w:r>
       <w:r>
         <w:rPr>
@@ -6577,135 +5833,6 @@
           <w:highlight w:val="red"/>
           <w:u w:val="single"/>
         </w:rPr>
-        <w:t>$73,877</w:t>
-      </w:r>
-      <w:r>
-        <w:rPr>
-          <w:bCs/>
-          <w:sz w:val="24"/>
-          <w:szCs w:val="24"/>
-          <w:highlight w:val="red"/>
-          <w:u w:val="single"/>
-        </w:rPr>
-        <w:fldChar w:fldCharType="end"/>
-      </w:r>
-      <w:r>
-        <w:rPr>
-          <w:bCs/>
-          <w:sz w:val="24"/>
-          <w:szCs w:val="24"/>
-        </w:rPr>
-        <w:t xml:space="preserve">. The present value of employer fringe contributions is </w:t>
-      </w:r>
-      <w:r>
-        <w:rPr>
-          <w:bCs/>
-          <w:sz w:val="24"/>
-          <w:szCs w:val="24"/>
-          <w:highlight w:val="red"/>
-          <w:u w:val="single"/>
-        </w:rPr>
-        <w:fldChar w:fldCharType="begin"/>
-      </w:r>
-      <w:r>
-        <w:rPr>
-          <w:bCs/>
-          <w:sz w:val="24"/>
-          <w:szCs w:val="24"/>
-          <w:highlight w:val="red"/>
-          <w:u w:val="single"/>
-        </w:rPr>
-        <w:instrText xml:space="preserve"> DOCVARIABLE "zapLink¦2!1!PV_Employer_Fringe_Contrib" </w:instrText>
-      </w:r>
-      <w:r>
-        <w:rPr>
-          <w:bCs/>
-          <w:sz w:val="24"/>
-          <w:szCs w:val="24"/>
-          <w:highlight w:val="red"/>
-          <w:u w:val="single"/>
-        </w:rPr>
-        <w:fldChar w:fldCharType="separate"/>
-      </w:r>
-      <w:r>
-        <w:rPr>
-          <w:bCs/>
-          <w:sz w:val="24"/>
-          <w:szCs w:val="24"/>
-          <w:highlight w:val="red"/>
-          <w:u w:val="single"/>
-        </w:rPr>
-        <w:t>$92,569</w:t>
-      </w:r>
-      <w:r>
-        <w:rPr>
-          <w:bCs/>
-          <w:sz w:val="24"/>
-          <w:szCs w:val="24"/>
-          <w:highlight w:val="red"/>
-          <w:u w:val="single"/>
-        </w:rPr>
-        <w:fldChar w:fldCharType="end"/>
-      </w:r>
-      <w:r>
-        <w:rPr>
-          <w:bCs/>
-          <w:sz w:val="24"/>
-          <w:szCs w:val="24"/>
-        </w:rPr>
-        <w:t xml:space="preserve"> under the base of </w:t>
-      </w:r>
-      <w:r>
-        <w:rPr>
-          <w:bCs/>
-          <w:sz w:val="24"/>
-          <w:szCs w:val="24"/>
-          <w:highlight w:val="yellow"/>
-        </w:rPr>
-        <w:t xml:space="preserve">{{ </w:t>
-      </w:r>
-      <w:r>
-        <w:rPr>
-          <w:bCs/>
-          <w:sz w:val="24"/>
-          <w:szCs w:val="24"/>
-        </w:rPr>
-        <w:t>b1e_WLE_earnings</w:t>
-      </w:r>
-      <w:r>
-        <w:rPr>
-          <w:bCs/>
-          <w:sz w:val="24"/>
-          <w:szCs w:val="24"/>
-          <w:highlight w:val="yellow"/>
-        </w:rPr>
-        <w:t xml:space="preserve"> }}</w:t>
-      </w:r>
-      <w:r>
-        <w:rPr>
-          <w:bCs/>
-          <w:sz w:val="24"/>
-          <w:szCs w:val="24"/>
-        </w:rPr>
-        <w:t xml:space="preserve"> or </w:t>
-      </w:r>
-      <w:r>
-        <w:rPr>
-          <w:sz w:val="24"/>
-          <w:szCs w:val="24"/>
-          <w:highlight w:val="red"/>
-          <w:u w:val="single"/>
-        </w:rPr>
-        <w:t>$</w:t>
-      </w:r>
-      <w:r>
-        <w:rPr>
-          <w:bCs/>
-          <w:sz w:val="24"/>
-          <w:szCs w:val="24"/>
-          <w:highlight w:val="red"/>
-          <w:u w:val="single"/>
-        </w:rPr>
         <w:t>129,767</w:t>
       </w:r>
       <w:r>
@@ -6714,41 +5841,7 @@
           <w:sz w:val="24"/>
           <w:szCs w:val="24"/>
         </w:rPr>
-        <w:t xml:space="preserve"> under the base of </w:t>
-      </w:r>
-      <w:r>
-        <w:rPr>
-          <w:bCs/>
-          <w:sz w:val="24"/>
-          <w:szCs w:val="24"/>
-          <w:highlight w:val="yellow"/>
-        </w:rPr>
-        <w:t xml:space="preserve">{{ </w:t>
-      </w:r>
-      <w:r>
-        <w:rPr>
-          <w:bCs/>
-          <w:sz w:val="24"/>
-          <w:szCs w:val="24"/>
-        </w:rPr>
-        <w:t>b2e_WLE_earnings</w:t>
-      </w:r>
-      <w:r>
-        <w:rPr>
-          <w:bCs/>
-          <w:sz w:val="24"/>
-          <w:szCs w:val="24"/>
-          <w:highlight w:val="yellow"/>
-        </w:rPr>
-        <w:t xml:space="preserve"> }}</w:t>
-      </w:r>
-      <w:r>
-        <w:rPr>
-          <w:bCs/>
-          <w:sz w:val="24"/>
-          <w:szCs w:val="24"/>
-        </w:rPr>
-        <w:t xml:space="preserve">. </w:t>
+        <w:t xml:space="preserve"> under the base of {{ b2e_WLE_earnings }}. </w:t>
       </w:r>
     </w:p>
     <w:p>
@@ -6895,42 +5988,7 @@
           <w:sz w:val="24"/>
           <w:szCs w:val="24"/>
         </w:rPr>
-        <w:t xml:space="preserve">. Using the costs as outlined in the life care plan dated </w:t>
-      </w:r>
-      <w:r>
-        <w:rPr>
-          <w:bCs/>
-          <w:sz w:val="24"/>
-          <w:szCs w:val="24"/>
-          <w:highlight w:val="yellow"/>
-        </w:rPr>
-        <w:t>{{ report_</w:t>
-      </w:r>
-      <w:r>
-        <w:rPr>
-          <w:bCs/>
-          <w:sz w:val="24"/>
-          <w:szCs w:val="24"/>
-          <w:highlight w:val="yellow"/>
-        </w:rPr>
-        <w:t>date</w:t>
-      </w:r>
-      <w:r>
-        <w:rPr>
-          <w:bCs/>
-          <w:sz w:val="24"/>
-          <w:szCs w:val="24"/>
-          <w:highlight w:val="yellow"/>
-        </w:rPr>
-        <w:t>_short }}</w:t>
-      </w:r>
-      <w:r>
-        <w:rPr>
-          <w:bCs/>
-          <w:sz w:val="24"/>
-          <w:szCs w:val="24"/>
-        </w:rPr>
-        <w:t xml:space="preserve">, I apply growth rates of </w:t>
+        <w:t xml:space="preserve">. Using the costs as outlined in the life care plan dated {{ report_date_short }}, I apply growth rates of </w:t>
       </w:r>
       <w:r>
         <w:rPr>
@@ -6956,7 +6014,25 @@
           <w:szCs w:val="24"/>
           <w:highlight w:val="red"/>
         </w:rPr>
-        <w:t>Physicians’ Services and All Items</w:t>
+        <w:t>Physicians</w:t>
+      </w:r>
+      <w:r>
+        <w:rPr>
+          <w:bCs/>
+          <w:sz w:val="24"/>
+          <w:szCs w:val="24"/>
+          <w:highlight w:val="red"/>
+        </w:rPr>
+        <w:t>'</w:t>
+      </w:r>
+      <w:r>
+        <w:rPr>
+          <w:bCs/>
+          <w:sz w:val="24"/>
+          <w:szCs w:val="24"/>
+          <w:highlight w:val="red"/>
+        </w:rPr>
+        <w:t xml:space="preserve"> Services and All Items</w:t>
       </w:r>
       <w:r>
         <w:rPr>
@@ -7126,7 +6202,25 @@
           <w:szCs w:val="24"/>
           <w:highlight w:val="green"/>
         </w:rPr>
-        <w:t>based on the long-range intermediate assumptions in the Social Security Administration’s Annual Trustee Report 2025.</w:t>
+        <w:t>based on the long-range intermediate assumptions in the Social Security Administration</w:t>
+      </w:r>
+      <w:r>
+        <w:rPr>
+          <w:bCs/>
+          <w:sz w:val="24"/>
+          <w:szCs w:val="24"/>
+          <w:highlight w:val="green"/>
+        </w:rPr>
+        <w:t>'</w:t>
+      </w:r>
+      <w:r>
+        <w:rPr>
+          <w:bCs/>
+          <w:sz w:val="24"/>
+          <w:szCs w:val="24"/>
+          <w:highlight w:val="green"/>
+        </w:rPr>
+        <w:t>s Annual Trustee Report 2025.</w:t>
       </w:r>
       <w:r>
         <w:rPr>
@@ -7361,14 +6455,6 @@
       </w:r>
       <w:r>
         <w:rPr>
-          <w:bCs/>
-          <w:sz w:val="24"/>
-          <w:szCs w:val="24"/>
-        </w:rPr>
-        <w:cr/>
-      </w:r>
-      <w:r>
-        <w:rPr>
           <w:b/>
           <w:sz w:val="24"/>
         </w:rPr>
@@ -7462,57 +6548,7 @@
                 <w:szCs w:val="28"/>
               </w:rPr>
               <w:tab/>
-              <w:t xml:space="preserve">BASE: </w:t>
-            </w:r>
-            <w:r>
-              <w:rPr>
-                <w:bCs/>
-                <w:iCs/>
-                <w:sz w:val="28"/>
-                <w:szCs w:val="28"/>
-                <w:highlight w:val="yellow"/>
-              </w:rPr>
-              <w:fldChar w:fldCharType="begin"/>
-            </w:r>
-            <w:r>
-              <w:rPr>
-                <w:bCs/>
-                <w:iCs/>
-                <w:sz w:val="28"/>
-                <w:szCs w:val="28"/>
-                <w:highlight w:val="yellow"/>
-              </w:rPr>
-              <w:instrText xml:space="preserve"> DOCVARIABLE "zapLink¦2!1!Primary_Earnings_Base_1" </w:instrText>
-            </w:r>
-            <w:r>
-              <w:rPr>
-                <w:bCs/>
-                <w:iCs/>
-                <w:sz w:val="28"/>
-                <w:szCs w:val="28"/>
-                <w:highlight w:val="yellow"/>
-              </w:rPr>
-              <w:fldChar w:fldCharType="separate"/>
-            </w:r>
-            <w:r>
-              <w:rPr>
-                <w:bCs/>
-                <w:iCs/>
-                <w:sz w:val="28"/>
-                <w:szCs w:val="28"/>
-                <w:highlight w:val="yellow"/>
-              </w:rPr>
-              <w:t xml:space="preserve">{{ b1e_WLE_earnings }} </w:t>
-            </w:r>
-            <w:r>
-              <w:rPr>
-                <w:bCs/>
-                <w:iCs/>
-                <w:sz w:val="28"/>
-                <w:szCs w:val="28"/>
-                <w:highlight w:val="yellow"/>
-              </w:rPr>
-              <w:fldChar w:fldCharType="end"/>
+              <w:t xml:space="preserve">BASE: {{ b1e_WLE_earnings }} </w:t>
             </w:r>
           </w:p>
         </w:tc>
@@ -7735,27 +6771,7 @@
                 <w:szCs w:val="28"/>
                 <w:highlight w:val="yellow"/>
               </w:rPr>
-              <w:t>{{r b1e_WLE_</w:t>
-            </w:r>
-            <w:r>
-              <w:rPr>
-                <w:bCs/>
-                <w:iCs/>
-                <w:sz w:val="28"/>
-                <w:szCs w:val="28"/>
-                <w:highlight w:val="yellow"/>
-              </w:rPr>
-              <w:t>pretrial_loss_adj</w:t>
-            </w:r>
-            <w:r>
-              <w:rPr>
-                <w:bCs/>
-                <w:iCs/>
-                <w:sz w:val="28"/>
-                <w:szCs w:val="28"/>
-                <w:highlight w:val="yellow"/>
-              </w:rPr>
-              <w:t xml:space="preserve"> }}</w:t>
+              <w:t>{{r b1e_WLE_pretrial_loss_adj }}</w:t>
             </w:r>
           </w:p>
           <w:p>
@@ -7780,47 +6796,7 @@
                 <w:szCs w:val="28"/>
                 <w:highlight w:val="yellow"/>
               </w:rPr>
-              <w:t>{{r b1e_</w:t>
-            </w:r>
-            <w:r>
-              <w:rPr>
-                <w:bCs/>
-                <w:iCs/>
-                <w:sz w:val="28"/>
-                <w:szCs w:val="28"/>
-                <w:highlight w:val="yellow"/>
-              </w:rPr>
-              <w:t>WLE_pretrial_</w:t>
-            </w:r>
-            <w:r>
-              <w:rPr>
-                <w:bCs/>
-                <w:iCs/>
-                <w:sz w:val="28"/>
-                <w:szCs w:val="28"/>
-                <w:highlight w:val="yellow"/>
-              </w:rPr>
-              <w:t>fringe_contributions</w:t>
-            </w:r>
-            <w:r>
-              <w:rPr>
-                <w:bCs/>
-                <w:iCs/>
-                <w:sz w:val="28"/>
-                <w:szCs w:val="28"/>
-                <w:highlight w:val="yellow"/>
-              </w:rPr>
-              <w:t>_adj</w:t>
-            </w:r>
-            <w:r>
-              <w:rPr>
-                <w:bCs/>
-                <w:iCs/>
-                <w:sz w:val="28"/>
-                <w:szCs w:val="28"/>
-                <w:highlight w:val="yellow"/>
-              </w:rPr>
-              <w:t xml:space="preserve"> }}</w:t>
+              <w:t>{{r b1e_WLE_pretrial_fringe_contributions_adj }}</w:t>
             </w:r>
           </w:p>
           <w:p>
@@ -7860,97 +6836,7 @@
                 <w:szCs w:val="28"/>
                 <w:highlight w:val="yellow"/>
               </w:rPr>
-              <w:fldChar w:fldCharType="begin"/>
-            </w:r>
-            <w:r>
-              <w:rPr>
-                <w:bCs/>
-                <w:iCs/>
-                <w:sz w:val="28"/>
-                <w:szCs w:val="28"/>
-                <w:highlight w:val="yellow"/>
-              </w:rPr>
-              <w:instrText xml:space="preserve"> DOCVARIABLE "zapLink¦2!1!PV_Employer_Fringe_Contrib" </w:instrText>
-            </w:r>
-            <w:r>
-              <w:rPr>
-                <w:bCs/>
-                <w:iCs/>
-                <w:sz w:val="28"/>
-                <w:szCs w:val="28"/>
-                <w:highlight w:val="yellow"/>
-              </w:rPr>
-              <w:fldChar w:fldCharType="separate"/>
-            </w:r>
-            <w:r>
-              <w:rPr>
-                <w:bCs/>
-                <w:iCs/>
-                <w:sz w:val="28"/>
-                <w:szCs w:val="28"/>
-                <w:highlight w:val="yellow"/>
-              </w:rPr>
-              <w:t xml:space="preserve"> </w:t>
-            </w:r>
-            <w:r>
-              <w:rPr>
-                <w:bCs/>
-                <w:iCs/>
-                <w:sz w:val="28"/>
-                <w:szCs w:val="28"/>
-                <w:highlight w:val="yellow"/>
-              </w:rPr>
-              <w:t>{{r b1e_</w:t>
-            </w:r>
-            <w:r>
-              <w:rPr>
-                <w:bCs/>
-                <w:iCs/>
-                <w:sz w:val="28"/>
-                <w:szCs w:val="28"/>
-                <w:highlight w:val="yellow"/>
-              </w:rPr>
-              <w:t>WLE_pretrial_</w:t>
-            </w:r>
-            <w:r>
-              <w:rPr>
-                <w:bCs/>
-                <w:iCs/>
-                <w:sz w:val="28"/>
-                <w:szCs w:val="28"/>
-                <w:highlight w:val="yellow"/>
-              </w:rPr>
-              <w:t>meals</w:t>
-            </w:r>
-            <w:r>
-              <w:rPr>
-                <w:bCs/>
-                <w:iCs/>
-                <w:sz w:val="28"/>
-                <w:szCs w:val="28"/>
-                <w:highlight w:val="yellow"/>
-              </w:rPr>
-              <w:fldChar w:fldCharType="end"/>
-            </w:r>
-            <w:r>
-              <w:rPr>
-                <w:bCs/>
-                <w:iCs/>
-                <w:sz w:val="28"/>
-                <w:szCs w:val="28"/>
-                <w:highlight w:val="yellow"/>
-              </w:rPr>
-              <w:t>_</w:t>
-            </w:r>
-            <w:r>
-              <w:rPr>
-                <w:bCs/>
-                <w:iCs/>
-                <w:sz w:val="28"/>
-                <w:szCs w:val="28"/>
-                <w:highlight w:val="yellow"/>
-              </w:rPr>
-              <w:t>adj }}</w:t>
+              <w:t xml:space="preserve"> {{r b1e_WLE_pretrial_meals_adj }}</w:t>
             </w:r>
           </w:p>
         </w:tc>
@@ -8007,46 +6893,6 @@
               </w:rPr>
               <w:t xml:space="preserve">: </w:t>
             </w:r>
-            <w:r>
-              <w:rPr>
-                <w:bCs/>
-                <w:iCs/>
-                <w:sz w:val="28"/>
-                <w:szCs w:val="28"/>
-                <w:highlight w:val="yellow"/>
-              </w:rPr>
-              <w:fldChar w:fldCharType="begin"/>
-            </w:r>
-            <w:r>
-              <w:rPr>
-                <w:bCs/>
-                <w:iCs/>
-                <w:sz w:val="28"/>
-                <w:szCs w:val="28"/>
-                <w:highlight w:val="yellow"/>
-              </w:rPr>
-              <w:instrText xml:space="preserve"> DOCVARIABLE "zapLink¦2!1!Primary_Earnings_Base_1" </w:instrText>
-            </w:r>
-            <w:r>
-              <w:rPr>
-                <w:bCs/>
-                <w:iCs/>
-                <w:sz w:val="28"/>
-                <w:szCs w:val="28"/>
-                <w:highlight w:val="yellow"/>
-              </w:rPr>
-              <w:fldChar w:fldCharType="separate"/>
-            </w:r>
-            <w:r>
-              <w:rPr>
-                <w:bCs/>
-                <w:iCs/>
-                <w:sz w:val="28"/>
-                <w:szCs w:val="28"/>
-                <w:highlight w:val="yellow"/>
-              </w:rPr>
-              <w:fldChar w:fldCharType="end"/>
-            </w:r>
           </w:p>
           <w:p>
             <w:pPr>
@@ -8107,36 +6953,7 @@
                 <w:sz w:val="28"/>
                 <w:szCs w:val="28"/>
               </w:rPr>
-              <w:t xml:space="preserve">After Credit for </w:t>
-            </w:r>
-            <w:r>
-              <w:rPr>
-                <w:bCs/>
-                <w:iCs/>
-                <w:sz w:val="28"/>
-                <w:szCs w:val="28"/>
-                <w:highlight w:val="red"/>
-              </w:rPr>
-              <w:t xml:space="preserve">{{r </w:t>
-            </w:r>
-            <w:r>
-              <w:rPr>
-                <w:bCs/>
-                <w:iCs/>
-                <w:sz w:val="28"/>
-                <w:szCs w:val="28"/>
-              </w:rPr>
-              <w:t>credit1_WLE_posttrial_adj</w:t>
-            </w:r>
-            <w:r>
-              <w:rPr>
-                <w:bCs/>
-                <w:iCs/>
-                <w:sz w:val="28"/>
-                <w:szCs w:val="28"/>
-                <w:highlight w:val="red"/>
-              </w:rPr>
-              <w:t>}}</w:t>
+              <w:t>After Credit for {{r credit1_WLE_posttrial_adj}}</w:t>
             </w:r>
           </w:p>
           <w:p>
@@ -8283,34 +7100,7 @@
                 <w:sz w:val="28"/>
                 <w:szCs w:val="28"/>
               </w:rPr>
-              <w:t xml:space="preserve">After Credit for {{r </w:t>
-            </w:r>
-            <w:r>
-              <w:rPr>
-                <w:bCs/>
-                <w:iCs/>
-                <w:sz w:val="28"/>
-                <w:szCs w:val="28"/>
-              </w:rPr>
-              <w:t>credit2_WLE_posttrial_adj</w:t>
-            </w:r>
-            <w:r>
-              <w:rPr>
-                <w:bCs/>
-                <w:iCs/>
-                <w:sz w:val="28"/>
-                <w:szCs w:val="28"/>
-              </w:rPr>
-              <w:t xml:space="preserve"> </w:t>
-            </w:r>
-            <w:r>
-              <w:rPr>
-                <w:bCs/>
-                <w:iCs/>
-                <w:sz w:val="28"/>
-                <w:szCs w:val="28"/>
-              </w:rPr>
-              <w:t>}}</w:t>
+              <w:t>After Credit for {{r credit2_WLE_posttrial_adj }}</w:t>
             </w:r>
           </w:p>
           <w:p>
@@ -8573,17 +7363,7 @@
                 <w:szCs w:val="28"/>
                 <w:highlight w:val="yellow"/>
               </w:rPr>
-              <w:t xml:space="preserve">             </w:t>
-            </w:r>
-            <w:r>
-              <w:rPr>
-                <w:bCs/>
-                <w:iCs/>
-                <w:sz w:val="28"/>
-                <w:szCs w:val="28"/>
-                <w:highlight w:val="yellow"/>
-              </w:rPr>
-              <w:t>{{r b1e_WLE_posttrial_loss_adj }}</w:t>
+              <w:t xml:space="preserve">             {{r b1e_WLE_posttrial_loss_adj }}</w:t>
             </w:r>
           </w:p>
           <w:p>
@@ -8611,77 +7391,7 @@
                 <w:szCs w:val="28"/>
                 <w:highlight w:val="yellow"/>
               </w:rPr>
-              <w:fldChar w:fldCharType="begin"/>
-            </w:r>
-            <w:r>
-              <w:rPr>
-                <w:bCs/>
-                <w:iCs/>
-                <w:sz w:val="28"/>
-                <w:szCs w:val="28"/>
-                <w:highlight w:val="yellow"/>
-              </w:rPr>
-              <w:instrText xml:space="preserve"> DOCVARIABLE "zapLink¦2!1!PV_Employer_Fringe_Contrib" </w:instrText>
-            </w:r>
-            <w:r>
-              <w:rPr>
-                <w:bCs/>
-                <w:iCs/>
-                <w:sz w:val="28"/>
-                <w:szCs w:val="28"/>
-                <w:highlight w:val="yellow"/>
-              </w:rPr>
-              <w:fldChar w:fldCharType="separate"/>
-            </w:r>
-            <w:r>
-              <w:rPr>
-                <w:bCs/>
-                <w:iCs/>
-                <w:sz w:val="28"/>
-                <w:szCs w:val="28"/>
-                <w:highlight w:val="yellow"/>
-              </w:rPr>
-              <w:t xml:space="preserve"> </w:t>
-            </w:r>
-            <w:r>
-              <w:rPr>
-                <w:bCs/>
-                <w:iCs/>
-                <w:sz w:val="28"/>
-                <w:szCs w:val="28"/>
-                <w:highlight w:val="yellow"/>
-              </w:rPr>
-              <w:t>{{r b1e_WLE_posttrial_fringe_contributions_adj }}</w:t>
-            </w:r>
-            <w:r>
-              <w:rPr>
-                <w:bCs/>
-                <w:iCs/>
-                <w:sz w:val="28"/>
-                <w:szCs w:val="28"/>
-                <w:highlight w:val="yellow"/>
-              </w:rPr>
-              <w:t xml:space="preserve"> </w:t>
-            </w:r>
-            <w:r>
-              <w:rPr>
-                <w:bCs/>
-                <w:iCs/>
-                <w:sz w:val="28"/>
-                <w:szCs w:val="28"/>
-                <w:highlight w:val="yellow"/>
-              </w:rPr>
-              <w:fldChar w:fldCharType="end"/>
-            </w:r>
-            <w:r>
-              <w:rPr>
-                <w:bCs/>
-                <w:iCs/>
-                <w:sz w:val="28"/>
-                <w:szCs w:val="28"/>
-                <w:highlight w:val="yellow"/>
-              </w:rPr>
-              <w:t xml:space="preserve">              </w:t>
+              <w:t xml:space="preserve"> {{r b1e_WLE_posttrial_fringe_contributions_adj }}               </w:t>
             </w:r>
           </w:p>
           <w:p>
@@ -8822,47 +7532,7 @@
                 <w:szCs w:val="28"/>
                 <w:highlight w:val="yellow"/>
               </w:rPr>
-              <w:fldChar w:fldCharType="begin"/>
-            </w:r>
-            <w:r>
-              <w:rPr>
-                <w:bCs/>
-                <w:iCs/>
-                <w:sz w:val="28"/>
-                <w:szCs w:val="28"/>
-                <w:highlight w:val="yellow"/>
-              </w:rPr>
-              <w:instrText xml:space="preserve"> DOCVARIABLE "zapLink¦2!1!PV_Employer_Fringe_Contrib" </w:instrText>
-            </w:r>
-            <w:r>
-              <w:rPr>
-                <w:bCs/>
-                <w:iCs/>
-                <w:sz w:val="28"/>
-                <w:szCs w:val="28"/>
-                <w:highlight w:val="yellow"/>
-              </w:rPr>
-              <w:fldChar w:fldCharType="separate"/>
-            </w:r>
-            <w:r>
-              <w:rPr>
-                <w:bCs/>
-                <w:iCs/>
-                <w:sz w:val="28"/>
-                <w:szCs w:val="28"/>
-                <w:highlight w:val="yellow"/>
-              </w:rPr>
               <w:t xml:space="preserve"> $92,569 </w:t>
-            </w:r>
-            <w:r>
-              <w:rPr>
-                <w:bCs/>
-                <w:iCs/>
-                <w:sz w:val="28"/>
-                <w:szCs w:val="28"/>
-                <w:highlight w:val="yellow"/>
-              </w:rPr>
-              <w:fldChar w:fldCharType="end"/>
             </w:r>
           </w:p>
           <w:p>
@@ -9001,19 +7671,31 @@
         <w:rPr>
           <w:rFonts w:ascii="TimesNewRomanPS-ItalicMT" w:hAnsi="TimesNewRomanPS-ItalicMT" w:cs="TimesNewRomanPS-ItalicMT"/>
         </w:rPr>
-        <w:t>{%p</w:t>
+        <w:t xml:space="preserve">{%p if </w:t>
       </w:r>
       <w:r>
         <w:rPr>
           <w:rFonts w:ascii="TimesNewRomanPS-ItalicMT" w:hAnsi="TimesNewRomanPS-ItalicMT" w:cs="TimesNewRomanPS-ItalicMT"/>
         </w:rPr>
-        <w:t xml:space="preserve"> </w:t>
+        <w:t>'</w:t>
       </w:r>
       <w:r>
         <w:rPr>
           <w:rFonts w:ascii="TimesNewRomanPS-ItalicMT" w:hAnsi="TimesNewRomanPS-ItalicMT" w:cs="TimesNewRomanPS-ItalicMT"/>
         </w:rPr>
-        <w:t>if ‘LCP’ in rehab_report_types %}</w:t>
+        <w:t>LCP</w:t>
+      </w:r>
+      <w:r>
+        <w:rPr>
+          <w:rFonts w:ascii="TimesNewRomanPS-ItalicMT" w:hAnsi="TimesNewRomanPS-ItalicMT" w:cs="TimesNewRomanPS-ItalicMT"/>
+        </w:rPr>
+        <w:t>'</w:t>
+      </w:r>
+      <w:r>
+        <w:rPr>
+          <w:rFonts w:ascii="TimesNewRomanPS-ItalicMT" w:hAnsi="TimesNewRomanPS-ItalicMT" w:cs="TimesNewRomanPS-ItalicMT"/>
+        </w:rPr>
+        <w:t xml:space="preserve"> in rehab_report_types %}</w:t>
       </w:r>
     </w:p>
     <w:p>
@@ -9067,14 +7749,7 @@
         <w:rPr>
           <w:rFonts w:ascii="TimesNewRomanPS-ItalicMT" w:hAnsi="TimesNewRomanPS-ItalicMT" w:cs="TimesNewRomanPS-ItalicMT"/>
         </w:rPr>
-        <w:t xml:space="preserve">: </w:t>
-      </w:r>
-      <w:r>
-        <w:rPr>
-          <w:rFonts w:ascii="TimesNewRomanPS-ItalicMT" w:hAnsi="TimesNewRomanPS-ItalicMT" w:cs="TimesNewRomanPS-ItalicMT"/>
-          <w:highlight w:val="yellow"/>
-        </w:rPr>
-        <w:t>{{ claimant_name_full }}</w:t>
+        <w:t>: {{ claimant_name_full }}</w:t>
       </w:r>
     </w:p>
     <w:p>
@@ -9089,19 +7764,7 @@
         <w:rPr>
           <w:noProof/>
         </w:rPr>
-        <w:t xml:space="preserve">{{ </w:t>
-      </w:r>
-      <w:r>
-        <w:rPr>
-          <w:noProof/>
-        </w:rPr>
-        <w:t>PV_Summary_No_Rounding</w:t>
-      </w:r>
-      <w:r>
-        <w:rPr>
-          <w:noProof/>
-        </w:rPr>
-        <w:t xml:space="preserve"> }}</w:t>
+        <w:t>{{ PV_Summary_No_Rounding }}</w:t>
       </w:r>
     </w:p>
     <w:p>
@@ -9213,7 +7876,31 @@
         <w:rPr>
           <w:rFonts w:ascii="TimesNewRomanPS-ItalicMT" w:hAnsi="TimesNewRomanPS-ItalicMT" w:cs="TimesNewRomanPS-ItalicMT"/>
         </w:rPr>
-        <w:t>{%p if ‘LCP’ in rehab_report_types %}</w:t>
+        <w:t xml:space="preserve">{%p if </w:t>
+      </w:r>
+      <w:r>
+        <w:rPr>
+          <w:rFonts w:ascii="TimesNewRomanPS-ItalicMT" w:hAnsi="TimesNewRomanPS-ItalicMT" w:cs="TimesNewRomanPS-ItalicMT"/>
+        </w:rPr>
+        <w:t>'</w:t>
+      </w:r>
+      <w:r>
+        <w:rPr>
+          <w:rFonts w:ascii="TimesNewRomanPS-ItalicMT" w:hAnsi="TimesNewRomanPS-ItalicMT" w:cs="TimesNewRomanPS-ItalicMT"/>
+        </w:rPr>
+        <w:t>LCP</w:t>
+      </w:r>
+      <w:r>
+        <w:rPr>
+          <w:rFonts w:ascii="TimesNewRomanPS-ItalicMT" w:hAnsi="TimesNewRomanPS-ItalicMT" w:cs="TimesNewRomanPS-ItalicMT"/>
+        </w:rPr>
+        <w:t>'</w:t>
+      </w:r>
+      <w:r>
+        <w:rPr>
+          <w:rFonts w:ascii="TimesNewRomanPS-ItalicMT" w:hAnsi="TimesNewRomanPS-ItalicMT" w:cs="TimesNewRomanPS-ItalicMT"/>
+        </w:rPr>
+        <w:t xml:space="preserve"> in rehab_report_types %}</w:t>
       </w:r>
     </w:p>
     <w:p>
@@ -9986,39 +8673,7 @@
                 <w:smallCaps/>
                 <w:sz w:val="24"/>
               </w:rPr>
-              <w:fldChar w:fldCharType="begin"/>
-            </w:r>
-            <w:r>
-              <w:rPr>
-                <w:bCs/>
-                <w:smallCaps/>
-                <w:sz w:val="24"/>
-              </w:rPr>
-              <w:instrText xml:space="preserve"> DOCVARIABLE "zapLink¦2!1!Place_of_Trial" </w:instrText>
-            </w:r>
-            <w:r>
-              <w:rPr>
-                <w:bCs/>
-                <w:smallCaps/>
-                <w:sz w:val="24"/>
-              </w:rPr>
-              <w:fldChar w:fldCharType="separate"/>
-            </w:r>
-            <w:r>
-              <w:rPr>
-                <w:bCs/>
-                <w:smallCaps/>
-                <w:sz w:val="24"/>
-              </w:rPr>
               <w:t xml:space="preserve">{{r court_jurisdiction }} </w:t>
-            </w:r>
-            <w:r>
-              <w:rPr>
-                <w:bCs/>
-                <w:smallCaps/>
-                <w:sz w:val="24"/>
-              </w:rPr>
-              <w:fldChar w:fldCharType="end"/>
             </w:r>
           </w:p>
         </w:tc>
@@ -10573,23 +9228,7 @@
                 <w:smallCaps/>
                 <w:sz w:val="28"/>
               </w:rPr>
-              <w:t xml:space="preserve">{{r </w:t>
-            </w:r>
-            <w:r>
-              <w:rPr>
-                <w:bCs/>
-                <w:smallCaps/>
-                <w:sz w:val="28"/>
-              </w:rPr>
-              <w:t>eff_tax_rate</w:t>
-            </w:r>
-            <w:r>
-              <w:rPr>
-                <w:bCs/>
-                <w:smallCaps/>
-                <w:sz w:val="28"/>
-              </w:rPr>
-              <w:t>}}</w:t>
+              <w:t>{{r eff_tax_rate}}</w:t>
             </w:r>
           </w:p>
         </w:tc>
@@ -11110,39 +9749,7 @@
                 <w:smallCaps/>
                 <w:sz w:val="28"/>
               </w:rPr>
-              <w:fldChar w:fldCharType="begin"/>
-            </w:r>
-            <w:r>
-              <w:rPr>
-                <w:bCs/>
-                <w:smallCaps/>
-                <w:sz w:val="28"/>
-              </w:rPr>
-              <w:instrText xml:space="preserve"> DOCVARIABLE "zapLink¦2!1!Primary_Earnings_Base_1" </w:instrText>
-            </w:r>
-            <w:r>
-              <w:rPr>
-                <w:bCs/>
-                <w:smallCaps/>
-                <w:sz w:val="28"/>
-              </w:rPr>
-              <w:fldChar w:fldCharType="separate"/>
-            </w:r>
-            <w:r>
-              <w:rPr>
-                <w:bCs/>
-                <w:smallCaps/>
-                <w:sz w:val="28"/>
-              </w:rPr>
               <w:t xml:space="preserve">{{r b1e_WLE_earnings }} </w:t>
-            </w:r>
-            <w:r>
-              <w:rPr>
-                <w:bCs/>
-                <w:smallCaps/>
-                <w:sz w:val="28"/>
-              </w:rPr>
-              <w:fldChar w:fldCharType="end"/>
             </w:r>
           </w:p>
           <w:p>
@@ -11207,43 +9814,7 @@
                 <w:sz w:val="28"/>
                 <w:highlight w:val="yellow"/>
               </w:rPr>
-              <w:fldChar w:fldCharType="begin"/>
-            </w:r>
-            <w:r>
-              <w:rPr>
-                <w:bCs/>
-                <w:smallCaps/>
-                <w:sz w:val="28"/>
-                <w:highlight w:val="yellow"/>
-              </w:rPr>
-              <w:instrText xml:space="preserve"> DOCVARIABLE "zapLink¦2!1!Alternative_Earnings_Base" </w:instrText>
-            </w:r>
-            <w:r>
-              <w:rPr>
-                <w:bCs/>
-                <w:smallCaps/>
-                <w:sz w:val="28"/>
-                <w:highlight w:val="yellow"/>
-              </w:rPr>
-              <w:fldChar w:fldCharType="separate"/>
-            </w:r>
-            <w:r>
-              <w:rPr>
-                <w:bCs/>
-                <w:smallCaps/>
-                <w:sz w:val="28"/>
-                <w:highlight w:val="yellow"/>
-              </w:rPr>
               <w:t xml:space="preserve"> </w:t>
-            </w:r>
-            <w:r>
-              <w:rPr>
-                <w:bCs/>
-                <w:smallCaps/>
-                <w:sz w:val="28"/>
-                <w:highlight w:val="yellow"/>
-              </w:rPr>
-              <w:fldChar w:fldCharType="end"/>
             </w:r>
           </w:p>
           <w:p>
@@ -11454,71 +10025,7 @@
                 <w:smallCaps/>
                 <w:sz w:val="28"/>
               </w:rPr>
-              <w:t xml:space="preserve">{{r </w:t>
-            </w:r>
-            <w:r>
-              <w:rPr>
-                <w:bCs/>
-                <w:smallCaps/>
-                <w:sz w:val="28"/>
-              </w:rPr>
-              <w:t>PV2_WLE_DR_year_min_disc_rate</w:t>
-            </w:r>
-            <w:r>
-              <w:rPr>
-                <w:bCs/>
-                <w:smallCaps/>
-                <w:sz w:val="28"/>
-              </w:rPr>
-              <w:t xml:space="preserve"> }}%</w:t>
-            </w:r>
-            <w:r>
-              <w:rPr>
-                <w:bCs/>
-                <w:smallCaps/>
-                <w:sz w:val="28"/>
-              </w:rPr>
-              <w:t xml:space="preserve"> </w:t>
-            </w:r>
-            <w:r>
-              <w:rPr>
-                <w:bCs/>
-                <w:smallCaps/>
-                <w:sz w:val="28"/>
-              </w:rPr>
-              <w:t>-</w:t>
-            </w:r>
-            <w:r>
-              <w:rPr>
-                <w:bCs/>
-                <w:smallCaps/>
-                <w:sz w:val="28"/>
-              </w:rPr>
-              <w:t xml:space="preserve"> </w:t>
-            </w:r>
-            <w:r>
-              <w:rPr>
-                <w:bCs/>
-                <w:smallCaps/>
-                <w:sz w:val="28"/>
-              </w:rPr>
-              <w:t xml:space="preserve">{{r </w:t>
-            </w:r>
-            <w:r>
-              <w:rPr>
-                <w:bCs/>
-                <w:smallCaps/>
-                <w:sz w:val="28"/>
-              </w:rPr>
-              <w:t>PV2_WLE_DR_year_max_disc_rate</w:t>
-            </w:r>
-            <w:r>
-              <w:rPr>
-                <w:bCs/>
-                <w:smallCaps/>
-                <w:sz w:val="28"/>
-              </w:rPr>
-              <w:t xml:space="preserve"> }}%</w:t>
+              <w:t>{{r PV2_WLE_DR_year_min_disc_rate }}% - {{r PV2_WLE_DR_year_max_disc_rate }}%</w:t>
             </w:r>
           </w:p>
         </w:tc>
@@ -12144,7 +10651,31 @@
           <w:szCs w:val="24"/>
           <w:highlight w:val="red"/>
         </w:rPr>
-        <w:t>Physicians’ Services (CUUR0000SEMC01</w:t>
+        <w:t>Physicians</w:t>
+      </w:r>
+      <w:r>
+        <w:rPr>
+          <w:rFonts w:eastAsiaTheme="minorHAnsi"/>
+          <w:i/>
+          <w:iCs/>
+          <w:spacing w:val="0"/>
+          <w:sz w:val="24"/>
+          <w:szCs w:val="24"/>
+          <w:highlight w:val="red"/>
+        </w:rPr>
+        <w:t>'</w:t>
+      </w:r>
+      <w:r>
+        <w:rPr>
+          <w:rFonts w:eastAsiaTheme="minorHAnsi"/>
+          <w:i/>
+          <w:iCs/>
+          <w:spacing w:val="0"/>
+          <w:sz w:val="24"/>
+          <w:szCs w:val="24"/>
+          <w:highlight w:val="red"/>
+        </w:rPr>
+        <w:t xml:space="preserve"> Services (CUUR0000SEMC01</w:t>
       </w:r>
       <w:r>
         <w:rPr>
@@ -16848,14 +15379,19 @@
 </file>
 
 <file path=customXml/item1.xml><?xml version="1.0" encoding="utf-8"?>
-<p:properties xmlns:p="http://schemas.microsoft.com/office/2006/metadata/properties" xmlns:xsi="http://www.w3.org/2001/XMLSchema-instance" xmlns:pc="http://schemas.microsoft.com/office/infopath/2007/PartnerControls">
-  <documentManagement>
-    <_activity xmlns="91172594-76f2-42b4-b6c8-5686d13fb17f" xsi:nil="true"/>
-  </documentManagement>
-</p:properties>
+<?mso-contentType ?>
+<FormTemplates xmlns="http://schemas.microsoft.com/sharepoint/v3/contenttype/forms">
+  <Display>DocumentLibraryForm</Display>
+  <Edit>DocumentLibraryForm</Edit>
+  <New>DocumentLibraryForm</New>
+</FormTemplates>
 </file>
 
 <file path=customXml/item2.xml><?xml version="1.0" encoding="utf-8"?>
+<b:Sources xmlns:b="http://schemas.openxmlformats.org/officeDocument/2006/bibliography" xmlns="http://schemas.openxmlformats.org/officeDocument/2006/bibliography" SelectedStyle="\APASixthEditionOfficeOnline.xsl" StyleName="APA" Version="6"/>
+</file>
+
+<file path=customXml/item3.xml><?xml version="1.0" encoding="utf-8"?>
 <ct:contentTypeSchema xmlns:ct="http://schemas.microsoft.com/office/2006/metadata/contentType" xmlns:ma="http://schemas.microsoft.com/office/2006/metadata/properties/metaAttributes" ct:_="" ma:_="" ma:contentTypeName="Document" ma:contentTypeID="0x010100085B5888F14DAE46912A6E0F6FCFCB07" ma:contentTypeVersion="9" ma:contentTypeDescription="Create a new document." ma:contentTypeScope="" ma:versionID="2185b18d6fd5c46c37ca5df071e41de6">
   <xsd:schema xmlns:xsd="http://www.w3.org/2001/XMLSchema" xmlns:xs="http://www.w3.org/2001/XMLSchema" xmlns:p="http://schemas.microsoft.com/office/2006/metadata/properties" xmlns:ns3="91172594-76f2-42b4-b6c8-5686d13fb17f" targetNamespace="http://schemas.microsoft.com/office/2006/metadata/properties" ma:root="true" ma:fieldsID="3ce95284eb097024ce56720a48b923a2" ns3:_="">
     <xsd:import namespace="91172594-76f2-42b4-b6c8-5686d13fb17f"/>
@@ -17031,30 +15567,31 @@
 </ct:contentTypeSchema>
 </file>
 
-<file path=customXml/item3.xml><?xml version="1.0" encoding="utf-8"?>
-<b:Sources xmlns:b="http://schemas.openxmlformats.org/officeDocument/2006/bibliography" xmlns="http://schemas.openxmlformats.org/officeDocument/2006/bibliography" SelectedStyle="\APASixthEditionOfficeOnline.xsl" StyleName="APA" Version="6"/>
-</file>
-
 <file path=customXml/item4.xml><?xml version="1.0" encoding="utf-8"?>
-<?mso-contentType ?>
-<FormTemplates xmlns="http://schemas.microsoft.com/sharepoint/v3/contenttype/forms">
-  <Display>DocumentLibraryForm</Display>
-  <Edit>DocumentLibraryForm</Edit>
-  <New>DocumentLibraryForm</New>
-</FormTemplates>
+<p:properties xmlns:p="http://schemas.microsoft.com/office/2006/metadata/properties" xmlns:xsi="http://www.w3.org/2001/XMLSchema-instance" xmlns:pc="http://schemas.microsoft.com/office/infopath/2007/PartnerControls">
+  <documentManagement>
+    <_activity xmlns="91172594-76f2-42b4-b6c8-5686d13fb17f" xsi:nil="true"/>
+  </documentManagement>
+</p:properties>
 </file>
 
 <file path=customXml/itemProps1.xml><?xml version="1.0" encoding="utf-8"?>
-<ds:datastoreItem xmlns:ds="http://schemas.openxmlformats.org/officeDocument/2006/customXml" ds:itemID="{B4565CB4-100A-4A3D-B4D6-384A4DEF81CB}">
+<ds:datastoreItem xmlns:ds="http://schemas.openxmlformats.org/officeDocument/2006/customXml" ds:itemID="{510AB3BD-BC06-4C1C-BE0E-F78D828DF9A1}">
   <ds:schemaRefs>
-    <ds:schemaRef ds:uri="http://schemas.microsoft.com/office/2006/metadata/properties"/>
-    <ds:schemaRef ds:uri="http://schemas.microsoft.com/office/infopath/2007/PartnerControls"/>
-    <ds:schemaRef ds:uri="91172594-76f2-42b4-b6c8-5686d13fb17f"/>
+    <ds:schemaRef ds:uri="http://schemas.microsoft.com/sharepoint/v3/contenttype/forms"/>
   </ds:schemaRefs>
 </ds:datastoreItem>
 </file>
 
 <file path=customXml/itemProps2.xml><?xml version="1.0" encoding="utf-8"?>
+<ds:datastoreItem xmlns:ds="http://schemas.openxmlformats.org/officeDocument/2006/customXml" ds:itemID="{FCC1ACD0-7293-47C9-BE0B-4D879715608C}">
+  <ds:schemaRefs>
+    <ds:schemaRef ds:uri="http://schemas.openxmlformats.org/officeDocument/2006/bibliography"/>
+  </ds:schemaRefs>
+</ds:datastoreItem>
+</file>
+
+<file path=customXml/itemProps3.xml><?xml version="1.0" encoding="utf-8"?>
 <ds:datastoreItem xmlns:ds="http://schemas.openxmlformats.org/officeDocument/2006/customXml" ds:itemID="{8A7A12AC-3EA6-42CF-BE43-5DF49F85A7B6}">
   <ds:schemaRefs>
     <ds:schemaRef ds:uri="http://schemas.microsoft.com/office/2006/metadata/contentType"/>
@@ -17072,18 +15609,12 @@
 </ds:datastoreItem>
 </file>
 
-<file path=customXml/itemProps3.xml><?xml version="1.0" encoding="utf-8"?>
-<ds:datastoreItem xmlns:ds="http://schemas.openxmlformats.org/officeDocument/2006/customXml" ds:itemID="{FCC1ACD0-7293-47C9-BE0B-4D879715608C}">
+<file path=customXml/itemProps4.xml><?xml version="1.0" encoding="utf-8"?>
+<ds:datastoreItem xmlns:ds="http://schemas.openxmlformats.org/officeDocument/2006/customXml" ds:itemID="{B4565CB4-100A-4A3D-B4D6-384A4DEF81CB}">
   <ds:schemaRefs>
-    <ds:schemaRef ds:uri="http://schemas.openxmlformats.org/officeDocument/2006/bibliography"/>
-  </ds:schemaRefs>
-</ds:datastoreItem>
-</file>
-
-<file path=customXml/itemProps4.xml><?xml version="1.0" encoding="utf-8"?>
-<ds:datastoreItem xmlns:ds="http://schemas.openxmlformats.org/officeDocument/2006/customXml" ds:itemID="{510AB3BD-BC06-4C1C-BE0E-F78D828DF9A1}">
-  <ds:schemaRefs>
-    <ds:schemaRef ds:uri="http://schemas.microsoft.com/sharepoint/v3/contenttype/forms"/>
+    <ds:schemaRef ds:uri="http://schemas.microsoft.com/office/2006/metadata/properties"/>
+    <ds:schemaRef ds:uri="http://schemas.microsoft.com/office/infopath/2007/PartnerControls"/>
+    <ds:schemaRef ds:uri="91172594-76f2-42b4-b6c8-5686d13fb17f"/>
   </ds:schemaRefs>
 </ds:datastoreItem>
 </file>
</xml_diff>